<commit_message>
Manuals: mu-Tronic counts seven mu-On engines (FM Perc and Chord)
Co-Authored-By: Claude Sonnet 5.5 <noreply@anthropic.com>
</commit_message>
<xml_diff>
--- a/docs/mu-tronic/mu-Tronic User Manual.docx
+++ b/docs/mu-tronic/mu-Tronic User Manual.docx
@@ -54,7 +54,7 @@
     </w:p>
     <w:p>
       <w:r>
-        <w:t>mu-Tronic starts empty. It has sixteen layer slots, shown eight at a time on two pages. Into each slot you put one layer, chosen from the instruments of the other mu apps: a Rhythm from mu-Clid, a Pattern from mu-Tant, an Arp from mu-Toni, or one of mu-On's five engines (Kick, Bass, Hat, Snare and Rumble). A layer in mu-Tronic is the same instrument you know from its own app, with the same controls, modulators and presets. Mix and match as you like: sixteen layers, any combination.</w:t>
+        <w:t>mu-Tronic starts empty. It has sixteen layer slots, shown eight at a time on two pages. Into each slot you put one layer, chosen from the instruments of the other mu apps: a Rhythm from mu-Clid, a Pattern from mu-Tant, an Arp from mu-Toni, or one of mu-On's seven engines (Kick, Bass, Hat, Snare, Rumble, FM Perc and Chord). A layer in mu-Tronic is the same instrument you know from its own app, with the same controls, modulators and presets. Mix and match as you like: sixteen layers, any combination.</w:t>
       </w:r>
     </w:p>
     <w:p>
@@ -130,10 +130,10 @@
         </w:rPr>
         <w:lastRenderedPageBreak/>
         <w:drawing>
-          <wp:inline distT="0" distB="0" distL="0" distR="0" wp14:anchorId="6D4CF38E" wp14:editId="234D5E26">
+          <wp:inline distT="0" distB="0" distL="0" distR="0" wp14:anchorId="55E781AF" wp14:editId="6B290F88">
             <wp:extent cx="5274310" cy="3921760"/>
             <wp:effectExtent l="0" t="0" r="2540" b="2540"/>
-            <wp:docPr id="119808874" name="Picture 1"/>
+            <wp:docPr id="2051155160" name="Picture 1"/>
             <wp:cNvGraphicFramePr>
               <a:graphicFrameLocks xmlns:a="http://schemas.openxmlformats.org/drawingml/2006/main" noChangeAspect="1"/>
             </wp:cNvGraphicFramePr>
@@ -141,7 +141,7 @@
               <a:graphicData uri="http://schemas.openxmlformats.org/drawingml/2006/picture">
                 <pic:pic xmlns:pic="http://schemas.openxmlformats.org/drawingml/2006/picture">
                   <pic:nvPicPr>
-                    <pic:cNvPr id="119808874" name=""/>
+                    <pic:cNvPr id="2051155160" name=""/>
                     <pic:cNvPicPr/>
                   </pic:nvPicPr>
                   <pic:blipFill>
@@ -264,7 +264,7 @@
     </w:p>
     <w:p>
       <w:r>
-        <w:t>The main area takes the colour of the selected layer's type: purple for Rhythm, green for Pattern, blue for Arp and yellow for the five mu-On layers. The transport bar, sidebar, mixer and settings keep mu-Tronic's own ice-white and steel.</w:t>
+        <w:t>The main area takes the colour of the selected layer's type: purple for Rhythm, green for Pattern, blue for Arp and yellow for the seven mu-On layers. The transport bar, sidebar, mixer and settings keep mu-Tronic's own ice-white and steel.</w:t>
       </w:r>
     </w:p>
     <w:p>
@@ -382,10 +382,10 @@
           <w:noProof/>
         </w:rPr>
         <w:drawing>
-          <wp:inline distT="0" distB="0" distL="0" distR="0" wp14:anchorId="4BEB0607" wp14:editId="0A700283">
+          <wp:inline distT="0" distB="0" distL="0" distR="0" wp14:anchorId="2E38DC7C" wp14:editId="7E60B23B">
             <wp:extent cx="5274310" cy="162560"/>
             <wp:effectExtent l="0" t="0" r="2540" b="8890"/>
-            <wp:docPr id="1996561388" name="Picture 2"/>
+            <wp:docPr id="423878775" name="Picture 2"/>
             <wp:cNvGraphicFramePr>
               <a:graphicFrameLocks xmlns:a="http://schemas.openxmlformats.org/drawingml/2006/main" noChangeAspect="1"/>
             </wp:cNvGraphicFramePr>
@@ -393,7 +393,7 @@
               <a:graphicData uri="http://schemas.openxmlformats.org/drawingml/2006/picture">
                 <pic:pic xmlns:pic="http://schemas.openxmlformats.org/drawingml/2006/picture">
                   <pic:nvPicPr>
-                    <pic:cNvPr id="1996561388" name=""/>
+                    <pic:cNvPr id="423878775" name=""/>
                     <pic:cNvPicPr/>
                   </pic:nvPicPr>
                   <pic:blipFill>
@@ -503,10 +503,10 @@
           <w:noProof/>
         </w:rPr>
         <w:drawing>
-          <wp:inline distT="0" distB="0" distL="0" distR="0" wp14:anchorId="1CE94DEB" wp14:editId="67431852">
+          <wp:inline distT="0" distB="0" distL="0" distR="0" wp14:anchorId="1D9544A8" wp14:editId="293C1C5C">
             <wp:extent cx="464963" cy="4318000"/>
             <wp:effectExtent l="0" t="0" r="0" b="6350"/>
-            <wp:docPr id="467544282" name="Picture 3"/>
+            <wp:docPr id="1354613962" name="Picture 3"/>
             <wp:cNvGraphicFramePr>
               <a:graphicFrameLocks xmlns:a="http://schemas.openxmlformats.org/drawingml/2006/main" noChangeAspect="1"/>
             </wp:cNvGraphicFramePr>
@@ -514,7 +514,7 @@
               <a:graphicData uri="http://schemas.openxmlformats.org/drawingml/2006/picture">
                 <pic:pic xmlns:pic="http://schemas.openxmlformats.org/drawingml/2006/picture">
                   <pic:nvPicPr>
-                    <pic:cNvPr id="467544282" name=""/>
+                    <pic:cNvPr id="1354613962" name=""/>
                     <pic:cNvPicPr/>
                   </pic:nvPicPr>
                   <pic:blipFill>
@@ -627,7 +627,7 @@
         <w:pStyle w:val="ListBullet"/>
       </w:pPr>
       <w:r>
-        <w:t>mu-On  -  a framed group of five cards: Kick (909 kick drum), Bass (bass line), Hat (hi-hat), Snare (snare) and Rumble (rumble tail from a kick).</w:t>
+        <w:t>mu-On  -  a framed group of seven cards: Kick (909 kick drum), Bass (bass line), Hat (hi-hat), Snare (snare), Rumble (rumble tail from a kick), FM Perc (FM toms and percussion) and Chord (a chord player for dub-techno stabs).</w:t>
       </w:r>
     </w:p>
     <w:p>
@@ -655,10 +655,10 @@
         </w:rPr>
         <w:lastRenderedPageBreak/>
         <w:drawing>
-          <wp:inline distT="0" distB="0" distL="0" distR="0" wp14:anchorId="163B78BF" wp14:editId="129662D1">
+          <wp:inline distT="0" distB="0" distL="0" distR="0" wp14:anchorId="27BA0105" wp14:editId="2AF80182">
             <wp:extent cx="5274310" cy="3921760"/>
             <wp:effectExtent l="0" t="0" r="2540" b="2540"/>
-            <wp:docPr id="1236069379" name="Picture 4"/>
+            <wp:docPr id="1877691210" name="Picture 4"/>
             <wp:cNvGraphicFramePr>
               <a:graphicFrameLocks xmlns:a="http://schemas.openxmlformats.org/drawingml/2006/main" noChangeAspect="1"/>
             </wp:cNvGraphicFramePr>
@@ -666,7 +666,7 @@
               <a:graphicData uri="http://schemas.openxmlformats.org/drawingml/2006/picture">
                 <pic:pic xmlns:pic="http://schemas.openxmlformats.org/drawingml/2006/picture">
                   <pic:nvPicPr>
-                    <pic:cNvPr id="1236069379" name=""/>
+                    <pic:cNvPr id="1877691210" name=""/>
                     <pic:cNvPicPr/>
                   </pic:nvPicPr>
                   <pic:blipFill>
@@ -702,7 +702,7 @@
         <w:rPr>
           <w:i/>
         </w:rPr>
-        <w:t>The layer chooser for an empty slot: three product cards and the mu-On group of five engine cards.</w:t>
+        <w:t>The layer chooser for an empty slot: three product cards and the mu-On group of seven engine cards (Kick, Bass, Hat, Snare, Rumble, FM Perc and Chord).</w:t>
       </w:r>
     </w:p>
     <w:p>
@@ -1075,10 +1075,10 @@
           <w:noProof/>
         </w:rPr>
         <w:drawing>
-          <wp:inline distT="0" distB="0" distL="0" distR="0" wp14:anchorId="50C8495A" wp14:editId="20B67042">
+          <wp:inline distT="0" distB="0" distL="0" distR="0" wp14:anchorId="47892272" wp14:editId="2CB1DA3C">
             <wp:extent cx="1714500" cy="3238500"/>
             <wp:effectExtent l="0" t="0" r="0" b="0"/>
-            <wp:docPr id="936426133" name="Picture 5"/>
+            <wp:docPr id="1371335639" name="Picture 5"/>
             <wp:cNvGraphicFramePr>
               <a:graphicFrameLocks xmlns:a="http://schemas.openxmlformats.org/drawingml/2006/main" noChangeAspect="1"/>
             </wp:cNvGraphicFramePr>
@@ -1086,7 +1086,7 @@
               <a:graphicData uri="http://schemas.openxmlformats.org/drawingml/2006/picture">
                 <pic:pic xmlns:pic="http://schemas.openxmlformats.org/drawingml/2006/picture">
                   <pic:nvPicPr>
-                    <pic:cNvPr id="936426133" name=""/>
+                    <pic:cNvPr id="1371335639" name=""/>
                     <pic:cNvPicPr/>
                   </pic:nvPicPr>
                   <pic:blipFill>
@@ -1134,10 +1134,10 @@
           <w:noProof/>
         </w:rPr>
         <w:drawing>
-          <wp:inline distT="0" distB="0" distL="0" distR="0" wp14:anchorId="75FE3B78" wp14:editId="2425EC79">
+          <wp:inline distT="0" distB="0" distL="0" distR="0" wp14:anchorId="245BF38C" wp14:editId="37D2713B">
             <wp:extent cx="5274310" cy="376555"/>
             <wp:effectExtent l="0" t="0" r="2540" b="4445"/>
-            <wp:docPr id="1930828971" name="Picture 6"/>
+            <wp:docPr id="1051314610" name="Picture 6"/>
             <wp:cNvGraphicFramePr>
               <a:graphicFrameLocks xmlns:a="http://schemas.openxmlformats.org/drawingml/2006/main" noChangeAspect="1"/>
             </wp:cNvGraphicFramePr>
@@ -1145,7 +1145,7 @@
               <a:graphicData uri="http://schemas.openxmlformats.org/drawingml/2006/picture">
                 <pic:pic xmlns:pic="http://schemas.openxmlformats.org/drawingml/2006/picture">
                   <pic:nvPicPr>
-                    <pic:cNvPr id="1930828971" name=""/>
+                    <pic:cNvPr id="1051314610" name=""/>
                     <pic:cNvPicPr/>
                   </pic:nvPicPr>
                   <pic:blipFill>
@@ -1207,10 +1207,10 @@
         </w:rPr>
         <w:lastRenderedPageBreak/>
         <w:drawing>
-          <wp:inline distT="0" distB="0" distL="0" distR="0" wp14:anchorId="47F4FE8C" wp14:editId="50AAFCC4">
+          <wp:inline distT="0" distB="0" distL="0" distR="0" wp14:anchorId="76626374" wp14:editId="465EE38C">
             <wp:extent cx="5274310" cy="1626870"/>
             <wp:effectExtent l="0" t="0" r="2540" b="0"/>
-            <wp:docPr id="1758448408" name="Picture 7"/>
+            <wp:docPr id="266630881" name="Picture 7"/>
             <wp:cNvGraphicFramePr>
               <a:graphicFrameLocks xmlns:a="http://schemas.openxmlformats.org/drawingml/2006/main" noChangeAspect="1"/>
             </wp:cNvGraphicFramePr>
@@ -1218,7 +1218,7 @@
               <a:graphicData uri="http://schemas.openxmlformats.org/drawingml/2006/picture">
                 <pic:pic xmlns:pic="http://schemas.openxmlformats.org/drawingml/2006/picture">
                   <pic:nvPicPr>
-                    <pic:cNvPr id="1758448408" name=""/>
+                    <pic:cNvPr id="266630881" name=""/>
                     <pic:cNvPicPr/>
                   </pic:nvPicPr>
                   <pic:blipFill>
@@ -1369,10 +1369,10 @@
           <w:noProof/>
         </w:rPr>
         <w:drawing>
-          <wp:inline distT="0" distB="0" distL="0" distR="0" wp14:anchorId="3DDF1F65" wp14:editId="35039666">
+          <wp:inline distT="0" distB="0" distL="0" distR="0" wp14:anchorId="3676D67A" wp14:editId="3E5A66E5">
             <wp:extent cx="5274310" cy="3921760"/>
             <wp:effectExtent l="0" t="0" r="2540" b="2540"/>
-            <wp:docPr id="1249681020" name="Picture 8"/>
+            <wp:docPr id="1376249145" name="Picture 8"/>
             <wp:cNvGraphicFramePr>
               <a:graphicFrameLocks xmlns:a="http://schemas.openxmlformats.org/drawingml/2006/main" noChangeAspect="1"/>
             </wp:cNvGraphicFramePr>
@@ -1380,7 +1380,7 @@
               <a:graphicData uri="http://schemas.openxmlformats.org/drawingml/2006/picture">
                 <pic:pic xmlns:pic="http://schemas.openxmlformats.org/drawingml/2006/picture">
                   <pic:nvPicPr>
-                    <pic:cNvPr id="1249681020" name=""/>
+                    <pic:cNvPr id="1376249145" name=""/>
                     <pic:cNvPicPr/>
                   </pic:nvPicPr>
                   <pic:blipFill>
@@ -1429,10 +1429,10 @@
         </w:rPr>
         <w:lastRenderedPageBreak/>
         <w:drawing>
-          <wp:inline distT="0" distB="0" distL="0" distR="0" wp14:anchorId="4435A348" wp14:editId="5D25A65C">
+          <wp:inline distT="0" distB="0" distL="0" distR="0" wp14:anchorId="53E0945D" wp14:editId="10129C10">
             <wp:extent cx="5274310" cy="3921760"/>
             <wp:effectExtent l="0" t="0" r="2540" b="2540"/>
-            <wp:docPr id="1686673234" name="Picture 9"/>
+            <wp:docPr id="1585196116" name="Picture 9"/>
             <wp:cNvGraphicFramePr>
               <a:graphicFrameLocks xmlns:a="http://schemas.openxmlformats.org/drawingml/2006/main" noChangeAspect="1"/>
             </wp:cNvGraphicFramePr>
@@ -1440,7 +1440,7 @@
               <a:graphicData uri="http://schemas.openxmlformats.org/drawingml/2006/picture">
                 <pic:pic xmlns:pic="http://schemas.openxmlformats.org/drawingml/2006/picture">
                   <pic:nvPicPr>
-                    <pic:cNvPr id="1686673234" name=""/>
+                    <pic:cNvPr id="1585196116" name=""/>
                     <pic:cNvPicPr/>
                   </pic:nvPicPr>
                   <pic:blipFill>
@@ -1774,10 +1774,10 @@
           <w:noProof/>
         </w:rPr>
         <w:drawing>
-          <wp:inline distT="0" distB="0" distL="0" distR="0" wp14:anchorId="308B86AE" wp14:editId="2451A158">
+          <wp:inline distT="0" distB="0" distL="0" distR="0" wp14:anchorId="643F176A" wp14:editId="4176C6F0">
             <wp:extent cx="5274310" cy="162560"/>
             <wp:effectExtent l="0" t="0" r="2540" b="8890"/>
-            <wp:docPr id="2042985398" name="Picture 10"/>
+            <wp:docPr id="239821392" name="Picture 10"/>
             <wp:cNvGraphicFramePr>
               <a:graphicFrameLocks xmlns:a="http://schemas.openxmlformats.org/drawingml/2006/main" noChangeAspect="1"/>
             </wp:cNvGraphicFramePr>
@@ -1785,7 +1785,7 @@
               <a:graphicData uri="http://schemas.openxmlformats.org/drawingml/2006/picture">
                 <pic:pic xmlns:pic="http://schemas.openxmlformats.org/drawingml/2006/picture">
                   <pic:nvPicPr>
-                    <pic:cNvPr id="2042985398" name=""/>
+                    <pic:cNvPr id="239821392" name=""/>
                     <pic:cNvPicPr/>
                   </pic:nvPicPr>
                   <pic:blipFill>
@@ -2164,7 +2164,7 @@
   <w:abstractNum w:abstractNumId="0" w15:restartNumberingAfterBreak="0">
     <w:nsid w:val="FFFFFF89"/>
     <w:multiLevelType w:val="singleLevel"/>
-    <w:tmpl w:val="8640E328"/>
+    <w:tmpl w:val="F3FEDD44"/>
     <w:lvl w:ilvl="0">
       <w:start w:val="1"/>
       <w:numFmt w:val="bullet"/>
@@ -2182,7 +2182,7 @@
       </w:rPr>
     </w:lvl>
   </w:abstractNum>
-  <w:num w:numId="1" w16cid:durableId="1754471106">
+  <w:num w:numId="1" w16cid:durableId="8918029">
     <w:abstractNumId w:val="0"/>
   </w:num>
 </w:numbering>
@@ -2596,7 +2596,7 @@
     <w:link w:val="Heading1Char"/>
     <w:uiPriority w:val="9"/>
     <w:qFormat/>
-    <w:rsid w:val="00BE722B"/>
+    <w:rsid w:val="005610F8"/>
     <w:pPr>
       <w:keepNext/>
       <w:keepLines/>
@@ -2618,7 +2618,7 @@
     <w:uiPriority w:val="9"/>
     <w:unhideWhenUsed/>
     <w:qFormat/>
-    <w:rsid w:val="00BE722B"/>
+    <w:rsid w:val="005610F8"/>
     <w:pPr>
       <w:keepNext/>
       <w:keepLines/>
@@ -2640,7 +2640,7 @@
     <w:uiPriority w:val="9"/>
     <w:unhideWhenUsed/>
     <w:qFormat/>
-    <w:rsid w:val="00BE722B"/>
+    <w:rsid w:val="005610F8"/>
     <w:pPr>
       <w:keepNext/>
       <w:keepLines/>
@@ -2663,7 +2663,7 @@
     <w:semiHidden/>
     <w:unhideWhenUsed/>
     <w:qFormat/>
-    <w:rsid w:val="00BE722B"/>
+    <w:rsid w:val="005610F8"/>
     <w:pPr>
       <w:keepNext/>
       <w:keepLines/>
@@ -2686,7 +2686,7 @@
     <w:semiHidden/>
     <w:unhideWhenUsed/>
     <w:qFormat/>
-    <w:rsid w:val="00BE722B"/>
+    <w:rsid w:val="005610F8"/>
     <w:pPr>
       <w:keepNext/>
       <w:keepLines/>
@@ -2707,7 +2707,7 @@
     <w:semiHidden/>
     <w:unhideWhenUsed/>
     <w:qFormat/>
-    <w:rsid w:val="00BE722B"/>
+    <w:rsid w:val="005610F8"/>
     <w:pPr>
       <w:keepNext/>
       <w:keepLines/>
@@ -2730,7 +2730,7 @@
     <w:semiHidden/>
     <w:unhideWhenUsed/>
     <w:qFormat/>
-    <w:rsid w:val="00BE722B"/>
+    <w:rsid w:val="005610F8"/>
     <w:pPr>
       <w:keepNext/>
       <w:keepLines/>
@@ -2751,7 +2751,7 @@
     <w:semiHidden/>
     <w:unhideWhenUsed/>
     <w:qFormat/>
-    <w:rsid w:val="00BE722B"/>
+    <w:rsid w:val="005610F8"/>
     <w:pPr>
       <w:keepNext/>
       <w:keepLines/>
@@ -2774,7 +2774,7 @@
     <w:semiHidden/>
     <w:unhideWhenUsed/>
     <w:qFormat/>
-    <w:rsid w:val="00BE722B"/>
+    <w:rsid w:val="005610F8"/>
     <w:pPr>
       <w:keepNext/>
       <w:keepLines/>
@@ -2818,7 +2818,7 @@
     <w:basedOn w:val="DefaultParagraphFont"/>
     <w:link w:val="Heading1"/>
     <w:uiPriority w:val="9"/>
-    <w:rsid w:val="00BE722B"/>
+    <w:rsid w:val="005610F8"/>
     <w:rPr>
       <w:rFonts w:asciiTheme="majorHAnsi" w:eastAsiaTheme="majorEastAsia" w:hAnsiTheme="majorHAnsi" w:cstheme="majorBidi"/>
       <w:color w:val="0F4761" w:themeColor="accent1" w:themeShade="BF"/>
@@ -2831,7 +2831,7 @@
     <w:basedOn w:val="DefaultParagraphFont"/>
     <w:link w:val="Heading2"/>
     <w:uiPriority w:val="9"/>
-    <w:rsid w:val="00BE722B"/>
+    <w:rsid w:val="005610F8"/>
     <w:rPr>
       <w:rFonts w:asciiTheme="majorHAnsi" w:eastAsiaTheme="majorEastAsia" w:hAnsiTheme="majorHAnsi" w:cstheme="majorBidi"/>
       <w:color w:val="0F4761" w:themeColor="accent1" w:themeShade="BF"/>
@@ -2844,7 +2844,7 @@
     <w:basedOn w:val="DefaultParagraphFont"/>
     <w:link w:val="Heading3"/>
     <w:uiPriority w:val="9"/>
-    <w:rsid w:val="00BE722B"/>
+    <w:rsid w:val="005610F8"/>
     <w:rPr>
       <w:rFonts w:eastAsiaTheme="majorEastAsia" w:cstheme="majorBidi"/>
       <w:color w:val="0F4761" w:themeColor="accent1" w:themeShade="BF"/>
@@ -2858,7 +2858,7 @@
     <w:link w:val="Heading4"/>
     <w:uiPriority w:val="9"/>
     <w:semiHidden/>
-    <w:rsid w:val="00BE722B"/>
+    <w:rsid w:val="005610F8"/>
     <w:rPr>
       <w:rFonts w:eastAsiaTheme="majorEastAsia" w:cstheme="majorBidi"/>
       <w:i/>
@@ -2872,7 +2872,7 @@
     <w:link w:val="Heading5"/>
     <w:uiPriority w:val="9"/>
     <w:semiHidden/>
-    <w:rsid w:val="00BE722B"/>
+    <w:rsid w:val="005610F8"/>
     <w:rPr>
       <w:rFonts w:eastAsiaTheme="majorEastAsia" w:cstheme="majorBidi"/>
       <w:color w:val="0F4761" w:themeColor="accent1" w:themeShade="BF"/>
@@ -2884,7 +2884,7 @@
     <w:link w:val="Heading6"/>
     <w:uiPriority w:val="9"/>
     <w:semiHidden/>
-    <w:rsid w:val="00BE722B"/>
+    <w:rsid w:val="005610F8"/>
     <w:rPr>
       <w:rFonts w:eastAsiaTheme="majorEastAsia" w:cstheme="majorBidi"/>
       <w:i/>
@@ -2898,7 +2898,7 @@
     <w:link w:val="Heading7"/>
     <w:uiPriority w:val="9"/>
     <w:semiHidden/>
-    <w:rsid w:val="00BE722B"/>
+    <w:rsid w:val="005610F8"/>
     <w:rPr>
       <w:rFonts w:eastAsiaTheme="majorEastAsia" w:cstheme="majorBidi"/>
       <w:color w:val="595959" w:themeColor="text1" w:themeTint="A6"/>
@@ -2910,7 +2910,7 @@
     <w:link w:val="Heading8"/>
     <w:uiPriority w:val="9"/>
     <w:semiHidden/>
-    <w:rsid w:val="00BE722B"/>
+    <w:rsid w:val="005610F8"/>
     <w:rPr>
       <w:rFonts w:eastAsiaTheme="majorEastAsia" w:cstheme="majorBidi"/>
       <w:i/>
@@ -2924,7 +2924,7 @@
     <w:link w:val="Heading9"/>
     <w:uiPriority w:val="9"/>
     <w:semiHidden/>
-    <w:rsid w:val="00BE722B"/>
+    <w:rsid w:val="005610F8"/>
     <w:rPr>
       <w:rFonts w:eastAsiaTheme="majorEastAsia" w:cstheme="majorBidi"/>
       <w:color w:val="272727" w:themeColor="text1" w:themeTint="D8"/>
@@ -2937,7 +2937,7 @@
     <w:link w:val="TitleChar"/>
     <w:uiPriority w:val="10"/>
     <w:qFormat/>
-    <w:rsid w:val="00BE722B"/>
+    <w:rsid w:val="005610F8"/>
     <w:pPr>
       <w:spacing w:after="80" w:line="240" w:lineRule="auto"/>
       <w:contextualSpacing/>
@@ -2955,7 +2955,7 @@
     <w:basedOn w:val="DefaultParagraphFont"/>
     <w:link w:val="Title"/>
     <w:uiPriority w:val="10"/>
-    <w:rsid w:val="00BE722B"/>
+    <w:rsid w:val="005610F8"/>
     <w:rPr>
       <w:rFonts w:asciiTheme="majorHAnsi" w:eastAsiaTheme="majorEastAsia" w:hAnsiTheme="majorHAnsi" w:cstheme="majorBidi"/>
       <w:spacing w:val="-10"/>
@@ -2971,7 +2971,7 @@
     <w:link w:val="SubtitleChar"/>
     <w:uiPriority w:val="11"/>
     <w:qFormat/>
-    <w:rsid w:val="00BE722B"/>
+    <w:rsid w:val="005610F8"/>
     <w:pPr>
       <w:numPr>
         <w:ilvl w:val="1"/>
@@ -2990,7 +2990,7 @@
     <w:basedOn w:val="DefaultParagraphFont"/>
     <w:link w:val="Subtitle"/>
     <w:uiPriority w:val="11"/>
-    <w:rsid w:val="00BE722B"/>
+    <w:rsid w:val="005610F8"/>
     <w:rPr>
       <w:rFonts w:eastAsiaTheme="majorEastAsia" w:cstheme="majorBidi"/>
       <w:color w:val="595959" w:themeColor="text1" w:themeTint="A6"/>
@@ -3006,7 +3006,7 @@
     <w:link w:val="QuoteChar"/>
     <w:uiPriority w:val="29"/>
     <w:qFormat/>
-    <w:rsid w:val="00BE722B"/>
+    <w:rsid w:val="005610F8"/>
     <w:pPr>
       <w:spacing w:before="160"/>
       <w:jc w:val="center"/>
@@ -3022,7 +3022,7 @@
     <w:basedOn w:val="DefaultParagraphFont"/>
     <w:link w:val="Quote"/>
     <w:uiPriority w:val="29"/>
-    <w:rsid w:val="00BE722B"/>
+    <w:rsid w:val="005610F8"/>
     <w:rPr>
       <w:i/>
       <w:iCs/>
@@ -3034,7 +3034,7 @@
     <w:basedOn w:val="Normal"/>
     <w:uiPriority w:val="34"/>
     <w:qFormat/>
-    <w:rsid w:val="00BE722B"/>
+    <w:rsid w:val="005610F8"/>
     <w:pPr>
       <w:ind w:left="720"/>
       <w:contextualSpacing/>
@@ -3045,7 +3045,7 @@
     <w:basedOn w:val="DefaultParagraphFont"/>
     <w:uiPriority w:val="21"/>
     <w:qFormat/>
-    <w:rsid w:val="00BE722B"/>
+    <w:rsid w:val="005610F8"/>
     <w:rPr>
       <w:i/>
       <w:iCs/>
@@ -3059,7 +3059,7 @@
     <w:link w:val="IntenseQuoteChar"/>
     <w:uiPriority w:val="30"/>
     <w:qFormat/>
-    <w:rsid w:val="00BE722B"/>
+    <w:rsid w:val="005610F8"/>
     <w:pPr>
       <w:pBdr>
         <w:top w:val="single" w:sz="4" w:space="10" w:color="0F4761" w:themeColor="accent1" w:themeShade="BF"/>
@@ -3080,7 +3080,7 @@
     <w:basedOn w:val="DefaultParagraphFont"/>
     <w:link w:val="IntenseQuote"/>
     <w:uiPriority w:val="30"/>
-    <w:rsid w:val="00BE722B"/>
+    <w:rsid w:val="005610F8"/>
     <w:rPr>
       <w:i/>
       <w:iCs/>
@@ -3092,7 +3092,7 @@
     <w:basedOn w:val="DefaultParagraphFont"/>
     <w:uiPriority w:val="32"/>
     <w:qFormat/>
-    <w:rsid w:val="00BE722B"/>
+    <w:rsid w:val="005610F8"/>
     <w:rPr>
       <w:b/>
       <w:bCs/>
@@ -3106,7 +3106,7 @@
     <w:basedOn w:val="Normal"/>
     <w:uiPriority w:val="99"/>
     <w:unhideWhenUsed/>
-    <w:rsid w:val="00BE722B"/>
+    <w:rsid w:val="005610F8"/>
     <w:pPr>
       <w:numPr>
         <w:numId w:val="1"/>

</xml_diff>

<commit_message>
Manuals: mu-Tronic release manual (PWYW licensing, clip copy/paste/auto-save, Launchpad chapter removed, PDF export entry)
Refs #1678: user manual for the live release

Version: v1.1.1451

Co-Authored-By: Claude Sonnet 5.5 <noreply@anthropic.com>
</commit_message>
<xml_diff>
--- a/docs/mu-tronic/mu-Tronic User Manual.docx
+++ b/docs/mu-tronic/mu-Tronic User Manual.docx
@@ -49,7 +49,7 @@
     </w:p>
     <w:p>
       <w:r>
-        <w:t>mu-Tronic is a performance unit from Transwarp Development Project. It is a standalone application: there is no VST3 or CLAP version. It is free.</w:t>
+        <w:t>mu-Tronic is a performance unit from Transwarp Development Project. It is a standalone application: there is no VST3 or CLAP version. mu-Tronic is Pay What You Want: pay what you like from £0 (suggested £20), and nothing is limited either way (see Supporting mu-Tronic).</w:t>
       </w:r>
     </w:p>
     <w:p>
@@ -130,10 +130,10 @@
         </w:rPr>
         <w:lastRenderedPageBreak/>
         <w:drawing>
-          <wp:inline distT="0" distB="0" distL="0" distR="0" wp14:anchorId="55E781AF" wp14:editId="6B290F88">
+          <wp:inline distT="0" distB="0" distL="0" distR="0" wp14:anchorId="5947465A" wp14:editId="5791AF5D">
             <wp:extent cx="5274310" cy="3921760"/>
             <wp:effectExtent l="0" t="0" r="2540" b="2540"/>
-            <wp:docPr id="2051155160" name="Picture 1"/>
+            <wp:docPr id="856824033" name="Picture 1"/>
             <wp:cNvGraphicFramePr>
               <a:graphicFrameLocks xmlns:a="http://schemas.openxmlformats.org/drawingml/2006/main" noChangeAspect="1"/>
             </wp:cNvGraphicFramePr>
@@ -141,7 +141,7 @@
               <a:graphicData uri="http://schemas.openxmlformats.org/drawingml/2006/picture">
                 <pic:pic xmlns:pic="http://schemas.openxmlformats.org/drawingml/2006/picture">
                   <pic:nvPicPr>
-                    <pic:cNvPr id="2051155160" name=""/>
+                    <pic:cNvPr id="856824033" name=""/>
                     <pic:cNvPicPr/>
                   </pic:nvPicPr>
                   <pic:blipFill>
@@ -190,7 +190,7 @@
     </w:p>
     <w:p>
       <w:r>
-        <w:t>mu-Tronic is a standalone application. Run mu-Tronic.exe from any location. It needs no licence key and shows no Support window.</w:t>
+        <w:t>mu-Tronic is a standalone application. Run mu-Tronic.exe from any location.</w:t>
       </w:r>
     </w:p>
     <w:p>
@@ -200,7 +200,75 @@
     </w:p>
     <w:p>
       <w:r>
-        <w:t>In the standalone application an Options button at the top left of the window opens the audio and MIDI device settings.</w:t>
+        <w:t>An Options button at the top left of the window opens the audio and MIDI device settings: the audio output, and the MIDI inputs and outputs (see MIDI In and Out).</w:t>
+      </w:r>
+    </w:p>
+    <w:p>
+      <w:pPr>
+        <w:pStyle w:val="Heading2"/>
+      </w:pPr>
+      <w:r>
+        <w:t>Supporting mu-Tronic</w:t>
+      </w:r>
+    </w:p>
+    <w:p>
+      <w:r>
+        <w:t>mu-Tronic is Pay What You Want. You choose what to pay, from £0 upwards (the suggested amount is £20), and nothing is limited either way: every feature works for everyone. Whatever you pay, even £0, you are sent a licence key by email from Lemon Squeezy, our payment provider. Entering the key removes the Support window. The key changes nothing else; mu-Tronic works the same with or without it.</w:t>
+      </w:r>
+    </w:p>
+    <w:p>
+      <w:r>
+        <w:t>A copy without a key shows a polite 'Support mu-Tronic' window once per session, the first time you open mu-Tronic after starting the app. It has three buttons:</w:t>
+      </w:r>
+    </w:p>
+    <w:p>
+      <w:pPr>
+        <w:pStyle w:val="ListBullet"/>
+      </w:pPr>
+      <w:r>
+        <w:t>Maybe later  -  closes the window and carries on. It will appear again next session.</w:t>
+      </w:r>
+    </w:p>
+    <w:p>
+      <w:pPr>
+        <w:pStyle w:val="ListBullet"/>
+      </w:pPr>
+      <w:r>
+        <w:lastRenderedPageBreak/>
+        <w:t>Enter licence key  -  opens the 'Enter licence key - mu-Tronic' panel, where you type in your key.</w:t>
+      </w:r>
+    </w:p>
+    <w:p>
+      <w:pPr>
+        <w:pStyle w:val="ListBullet"/>
+      </w:pPr>
+      <w:r>
+        <w:t>Pay what you like  -  opens the checkout page in your web browser. The suggested amount is £20, but £0 is fine. You receive a key either way.</w:t>
+      </w:r>
+    </w:p>
+    <w:p>
+      <w:r>
+        <w:t>The window cannot be switched off for good. To bring it back at any time, click the Support link at the right of the Status Bar, or the Support button in the About panel.</w:t>
+      </w:r>
+    </w:p>
+    <w:p>
+      <w:r>
+        <w:t>To enter your key, click Enter licence key in the Support window, or click the mu-Tronic logo to open the About panel and click Enter a key. In the 'Enter licence key - mu-Tronic' panel (it reads 'Enter your licence key to remove the support reminder. Everything works either way.'), paste your key into the Licence key box and click Activate (or press Return). If you do not have a key yet, click Pay what you like to open the checkout page in your web browser. mu-Tronic needs an internet connection the first time, to register the key. One key can be used on up to 5 machines. When the key is accepted the panel shows a confirmation and closes, the About panel thanks you for your support, and the Support window and Support link no longer appear.</w:t>
+      </w:r>
+    </w:p>
+    <w:p>
+      <w:r>
+        <w:t>A licensed copy, even one with a £0 key, shows 'Thank you for supporting mu-Tronic.' in the About panel, with a 'Want to give more?' link beneath it. The link opens the tip page in your web browser, where you can give any amount you like. It does not use up your key, and you do not have to give anything.</w:t>
+      </w:r>
+    </w:p>
+    <w:p>
+      <w:r>
+        <w:t>Once activated, mu-Tronic checks your key with the server now and then when it starts. If you are offline at that moment it carries on working as normal for up to 30 days.</w:t>
+      </w:r>
+    </w:p>
+    <w:p>
+      <w:r>
+        <w:t>If activation fails, the panel tells you why. Check that you pasted the whole key and that you are online, then try again. A key that has already been used on 5 machines needs one of them released first; use Contact Support at the bottom of the Settings page. If the computer has no internet connection at all, the licence key panel shows a machine code at the bottom. Send that code to Contact Support and you can be sent an offline licence file for that computer, to place in the mu-Tronic content folder.</w:t>
       </w:r>
     </w:p>
     <w:p>
@@ -245,25 +313,25 @@
         <w:pStyle w:val="ListBullet"/>
       </w:pPr>
       <w:r>
+        <w:t>Mixer overlay  -  opened from the transport bar, replacing the editor</w:t>
+      </w:r>
+    </w:p>
+    <w:p>
+      <w:pPr>
+        <w:pStyle w:val="ListBullet"/>
+      </w:pPr>
+      <w:r>
+        <w:t>Status Bar (bottom)  -  the name and value of the control you last touched, a Support link (until a licence key is entered), and the CPU readout at the right-hand end</w:t>
+      </w:r>
+    </w:p>
+    <w:p>
+      <w:r>
+        <w:t>The window has two sizes, Medium and Large, chosen in Settings (Display, Size). Everything scales with it.</w:t>
+      </w:r>
+    </w:p>
+    <w:p>
+      <w:r>
         <w:lastRenderedPageBreak/>
-        <w:t>Mixer overlay  -  opened from the transport bar, replacing the editor</w:t>
-      </w:r>
-    </w:p>
-    <w:p>
-      <w:pPr>
-        <w:pStyle w:val="ListBullet"/>
-      </w:pPr>
-      <w:r>
-        <w:t>Status Bar (bottom)  -  the name and value of the control you last touched, and the CPU readout at the right-hand end</w:t>
-      </w:r>
-    </w:p>
-    <w:p>
-      <w:r>
-        <w:t>The window has two sizes, Medium and Large, chosen in Settings (Display, Size). Everything scales with it.</w:t>
-      </w:r>
-    </w:p>
-    <w:p>
-      <w:r>
         <w:t>The main area takes the colour of the selected layer's type: purple for Rhythm, green for Pattern, blue for Arp and yellow for the seven mu-On layers. The transport bar, sidebar, mixer and settings keep mu-Tronic's own ice-white and steel.</w:t>
       </w:r>
     </w:p>
@@ -382,10 +450,10 @@
           <w:noProof/>
         </w:rPr>
         <w:drawing>
-          <wp:inline distT="0" distB="0" distL="0" distR="0" wp14:anchorId="2E38DC7C" wp14:editId="7E60B23B">
+          <wp:inline distT="0" distB="0" distL="0" distR="0" wp14:anchorId="4B109D0B" wp14:editId="081EC53E">
             <wp:extent cx="5274310" cy="162560"/>
             <wp:effectExtent l="0" t="0" r="2540" b="8890"/>
-            <wp:docPr id="423878775" name="Picture 2"/>
+            <wp:docPr id="210572567" name="Picture 2"/>
             <wp:cNvGraphicFramePr>
               <a:graphicFrameLocks xmlns:a="http://schemas.openxmlformats.org/drawingml/2006/main" noChangeAspect="1"/>
             </wp:cNvGraphicFramePr>
@@ -393,7 +461,7 @@
               <a:graphicData uri="http://schemas.openxmlformats.org/drawingml/2006/picture">
                 <pic:pic xmlns:pic="http://schemas.openxmlformats.org/drawingml/2006/picture">
                   <pic:nvPicPr>
-                    <pic:cNvPr id="423878775" name=""/>
+                    <pic:cNvPr id="210572567" name=""/>
                     <pic:cNvPicPr/>
                   </pic:nvPicPr>
                   <pic:blipFill>
@@ -437,28 +505,28 @@
         <w:pStyle w:val="Heading1"/>
       </w:pPr>
       <w:r>
+        <w:t>5. Slots and the Layer Sidebar</w:t>
+      </w:r>
+    </w:p>
+    <w:p>
+      <w:r>
+        <w:t>mu-Tronic has sixteen slots, numbered 1 to 16. The sidebar shows eight of them at a time. Each item shows the slot number, a small picture of the layer's type with a letter on it, and the layer's colour. A new mu-Tronic holds no layers at all: every slot is empty, and the first thing you see is the layer chooser (see Adding a Layer).</w:t>
+      </w:r>
+    </w:p>
+    <w:p>
+      <w:pPr>
+        <w:pStyle w:val="ListBullet"/>
+      </w:pPr>
+      <w:r>
+        <w:t>Select  -  click an item to select that slot. The selected slot is outlined and shown in the main area.</w:t>
+      </w:r>
+    </w:p>
+    <w:p>
+      <w:pPr>
+        <w:pStyle w:val="ListBullet"/>
+      </w:pPr>
+      <w:r>
         <w:lastRenderedPageBreak/>
-        <w:t>5. Slots and the Layer Sidebar</w:t>
-      </w:r>
-    </w:p>
-    <w:p>
-      <w:r>
-        <w:t>mu-Tronic has sixteen slots, numbered 1 to 16. The sidebar shows eight of them at a time. Each item shows the slot number, a small picture of the layer's type with a letter on it, and the layer's colour. A new mu-Tronic holds no layers at all: every slot is empty, and the first thing you see is the layer chooser (see Adding a Layer).</w:t>
-      </w:r>
-    </w:p>
-    <w:p>
-      <w:pPr>
-        <w:pStyle w:val="ListBullet"/>
-      </w:pPr>
-      <w:r>
-        <w:t>Select  -  click an item to select that slot. The selected slot is outlined and shown in the main area.</w:t>
-      </w:r>
-    </w:p>
-    <w:p>
-      <w:pPr>
-        <w:pStyle w:val="ListBullet"/>
-      </w:pPr>
-      <w:r>
         <w:t>Empty slots  -  shown with a + sign. They stay in the list, so the slots never move or renumber.</w:t>
       </w:r>
     </w:p>
@@ -503,10 +571,10 @@
           <w:noProof/>
         </w:rPr>
         <w:drawing>
-          <wp:inline distT="0" distB="0" distL="0" distR="0" wp14:anchorId="1D9544A8" wp14:editId="293C1C5C">
+          <wp:inline distT="0" distB="0" distL="0" distR="0" wp14:anchorId="7F05999A" wp14:editId="2AB55110">
             <wp:extent cx="464963" cy="4318000"/>
             <wp:effectExtent l="0" t="0" r="0" b="6350"/>
-            <wp:docPr id="1354613962" name="Picture 3"/>
+            <wp:docPr id="359522138" name="Picture 3"/>
             <wp:cNvGraphicFramePr>
               <a:graphicFrameLocks xmlns:a="http://schemas.openxmlformats.org/drawingml/2006/main" noChangeAspect="1"/>
             </wp:cNvGraphicFramePr>
@@ -514,7 +582,7 @@
               <a:graphicData uri="http://schemas.openxmlformats.org/drawingml/2006/picture">
                 <pic:pic xmlns:pic="http://schemas.openxmlformats.org/drawingml/2006/picture">
                   <pic:nvPicPr>
-                    <pic:cNvPr id="1354613962" name=""/>
+                    <pic:cNvPr id="359522138" name=""/>
                     <pic:cNvPicPr/>
                   </pic:nvPicPr>
                   <pic:blipFill>
@@ -550,25 +618,25 @@
         <w:rPr>
           <w:i/>
         </w:rPr>
+        <w:t>Layer Sidebar with a mix of layer types, one selected, empty slots shown with a plus sign.</w:t>
+      </w:r>
+    </w:p>
+    <w:p>
+      <w:pPr>
+        <w:pStyle w:val="Heading2"/>
+      </w:pPr>
+      <w:r>
+        <w:t>Pages</w:t>
+      </w:r>
+    </w:p>
+    <w:p>
+      <w:r>
+        <w:t>The page switch sits at the foot of the sidebar, under the engraved word Page. Click 1 for slots 1 to 8 or 2 for slots 9 to 16. You can also press Page Up and Page Down to move between pages; they stop at the first and last page. The keys work when no text box is being edited. While the mixer is open they change the mixer's page instead.</w:t>
+      </w:r>
+    </w:p>
+    <w:p>
+      <w:r>
         <w:lastRenderedPageBreak/>
-        <w:t>Layer Sidebar with a mix of layer types, one selected, empty slots shown with a plus sign.</w:t>
-      </w:r>
-    </w:p>
-    <w:p>
-      <w:pPr>
-        <w:pStyle w:val="Heading2"/>
-      </w:pPr>
-      <w:r>
-        <w:t>Pages</w:t>
-      </w:r>
-    </w:p>
-    <w:p>
-      <w:r>
-        <w:t>The page switch sits at the foot of the sidebar, under the engraved word Page. Click 1 for slots 1 to 8 or 2 for slots 9 to 16. You can also press Page Up and Page Down to move between pages; they stop at the first and last page. The keys work when no text box is being edited. While the mixer is open they change the mixer's page instead.</w:t>
-      </w:r>
-    </w:p>
-    <w:p>
-      <w:r>
         <w:t>Switching page selects the slot at the same position on the new page, so slot 3 goes to slot 11. Selecting a slot on the other page by any other route also switches the page to follow it.</w:t>
       </w:r>
     </w:p>
@@ -655,10 +723,10 @@
         </w:rPr>
         <w:lastRenderedPageBreak/>
         <w:drawing>
-          <wp:inline distT="0" distB="0" distL="0" distR="0" wp14:anchorId="27BA0105" wp14:editId="2AF80182">
+          <wp:inline distT="0" distB="0" distL="0" distR="0" wp14:anchorId="265CB9C9" wp14:editId="70100F75">
             <wp:extent cx="5274310" cy="3921760"/>
             <wp:effectExtent l="0" t="0" r="2540" b="2540"/>
-            <wp:docPr id="1877691210" name="Picture 4"/>
+            <wp:docPr id="1347997092" name="Picture 4"/>
             <wp:cNvGraphicFramePr>
               <a:graphicFrameLocks xmlns:a="http://schemas.openxmlformats.org/drawingml/2006/main" noChangeAspect="1"/>
             </wp:cNvGraphicFramePr>
@@ -666,7 +734,7 @@
               <a:graphicData uri="http://schemas.openxmlformats.org/drawingml/2006/picture">
                 <pic:pic xmlns:pic="http://schemas.openxmlformats.org/drawingml/2006/picture">
                   <pic:nvPicPr>
-                    <pic:cNvPr id="1877691210" name=""/>
+                    <pic:cNvPr id="1347997092" name=""/>
                     <pic:cNvPicPr/>
                   </pic:nvPicPr>
                   <pic:blipFill>
@@ -1007,12 +1075,12 @@
         <w:pStyle w:val="ListBullet"/>
       </w:pPr>
       <w:r>
-        <w:t>Right-click a pad (or Ctrl+click) for a menu with Store here and Clear.</w:t>
-      </w:r>
-    </w:p>
-    <w:p>
-      <w:r>
-        <w:t>Turning a knob changes only the playing layer, not the stored clip. To keep a tweak, store it again with Shift+click. Resetting a layer clears its clips; deleting a layer removes them with it. Clips are saved with the full preset and your session, but not in layer presets. A clip of a different layer type is never launched: the status bar says that the clip is for a different layer type.</w:t>
+        <w:t>Right-click a pad (or Ctrl+click) for a menu with Store here, Copy, Cut, Paste and Clear. Copy and Cut put the clip on a clipboard; Paste puts it in another pad, or in a pad of another layer of the same type, and asks first if the pad already holds a clip. Paste is greyed, with the reason in its text, when nothing has been copied or the copied clip is for a different layer type.</w:t>
+      </w:r>
+    </w:p>
+    <w:p>
+      <w:r>
+        <w:t>Auto-save: by default, edits you make to a layer while one of its clips is playing are written back into that clip a moment after you stop moving the control, so the clip you launch next time is the one you left. Switch this off with Auto-save clip edits in Settings (General, Clips); with it off, turning a knob changes only the playing layer, not the stored clip, and you keep a tweak by storing it again with Shift+click. Auto-save does nothing in Performance mode. Resetting a layer clears its clips; deleting a layer removes them with it. Clips are saved with the full preset and your session, but not in layer presets. A clip of a different layer type is never launched: the status bar says that the clip is for a different layer type.</w:t>
       </w:r>
     </w:p>
     <w:p>
@@ -1020,6 +1088,7 @@
         <w:pStyle w:val="Heading2"/>
       </w:pPr>
       <w:r>
+        <w:lastRenderedPageBreak/>
         <w:t>Scenes</w:t>
       </w:r>
     </w:p>
@@ -1057,7 +1126,6 @@
         <w:pStyle w:val="ListBullet"/>
       </w:pPr>
       <w:r>
-        <w:lastRenderedPageBreak/>
         <w:t>The status bar reads Clip n on N layers when a scene launches, or Clip n is empty when no layer has that clip.</w:t>
       </w:r>
     </w:p>
@@ -1075,10 +1143,10 @@
           <w:noProof/>
         </w:rPr>
         <w:drawing>
-          <wp:inline distT="0" distB="0" distL="0" distR="0" wp14:anchorId="47892272" wp14:editId="2CB1DA3C">
+          <wp:inline distT="0" distB="0" distL="0" distR="0" wp14:anchorId="7E516AC2" wp14:editId="15699E7C">
             <wp:extent cx="1714500" cy="3238500"/>
             <wp:effectExtent l="0" t="0" r="0" b="0"/>
-            <wp:docPr id="1371335639" name="Picture 5"/>
+            <wp:docPr id="510630831" name="Picture 5"/>
             <wp:cNvGraphicFramePr>
               <a:graphicFrameLocks xmlns:a="http://schemas.openxmlformats.org/drawingml/2006/main" noChangeAspect="1"/>
             </wp:cNvGraphicFramePr>
@@ -1086,7 +1154,7 @@
               <a:graphicData uri="http://schemas.openxmlformats.org/drawingml/2006/picture">
                 <pic:pic xmlns:pic="http://schemas.openxmlformats.org/drawingml/2006/picture">
                   <pic:nvPicPr>
-                    <pic:cNvPr id="1371335639" name=""/>
+                    <pic:cNvPr id="510630831" name=""/>
                     <pic:cNvPicPr/>
                   </pic:nvPicPr>
                   <pic:blipFill>
@@ -1134,10 +1202,10 @@
           <w:noProof/>
         </w:rPr>
         <w:drawing>
-          <wp:inline distT="0" distB="0" distL="0" distR="0" wp14:anchorId="245BF38C" wp14:editId="37D2713B">
+          <wp:inline distT="0" distB="0" distL="0" distR="0" wp14:anchorId="1D5ADA3F" wp14:editId="739A9DFA">
             <wp:extent cx="5274310" cy="376555"/>
             <wp:effectExtent l="0" t="0" r="2540" b="4445"/>
-            <wp:docPr id="1051314610" name="Picture 6"/>
+            <wp:docPr id="1278589023" name="Picture 6"/>
             <wp:cNvGraphicFramePr>
               <a:graphicFrameLocks xmlns:a="http://schemas.openxmlformats.org/drawingml/2006/main" noChangeAspect="1"/>
             </wp:cNvGraphicFramePr>
@@ -1145,7 +1213,7 @@
               <a:graphicData uri="http://schemas.openxmlformats.org/drawingml/2006/picture">
                 <pic:pic xmlns:pic="http://schemas.openxmlformats.org/drawingml/2006/picture">
                   <pic:nvPicPr>
-                    <pic:cNvPr id="1051314610" name=""/>
+                    <pic:cNvPr id="1278589023" name=""/>
                     <pic:cNvPicPr/>
                   </pic:nvPicPr>
                   <pic:blipFill>
@@ -1194,7 +1262,11 @@
     </w:p>
     <w:p>
       <w:r>
-        <w:t>Each layer has eight independent modulators (Mod A to Mod H) plus a Matrix tab, the same shared engine as the other mu apps, in the lower part of the layer editor. Each has a Stepped or Smooth mode, a polarity, a loop length, and its own targets with a depth from -100 to +100 percent. Which controls can be targets depends on the layer's type; see that app's manual.</w:t>
+        <w:t xml:space="preserve">Each layer has eight independent modulators (Mod A to Mod H) plus a Matrix tab, the same shared engine as the other mu apps, in the lower part of the layer editor. Each has </w:t>
+      </w:r>
+      <w:r>
+        <w:lastRenderedPageBreak/>
+        <w:t>a Stepped or Smooth mode, a polarity, a loop length, and its own targets with a depth from -100 to +100 percent. Which controls can be targets depends on the layer's type; see that app's manual.</w:t>
       </w:r>
     </w:p>
     <w:p>
@@ -1205,12 +1277,11 @@
         <w:rPr>
           <w:noProof/>
         </w:rPr>
-        <w:lastRenderedPageBreak/>
         <w:drawing>
-          <wp:inline distT="0" distB="0" distL="0" distR="0" wp14:anchorId="76626374" wp14:editId="465EE38C">
+          <wp:inline distT="0" distB="0" distL="0" distR="0" wp14:anchorId="21DB4ABE" wp14:editId="637E34BA">
             <wp:extent cx="5274310" cy="1626870"/>
             <wp:effectExtent l="0" t="0" r="2540" b="0"/>
-            <wp:docPr id="266630881" name="Picture 7"/>
+            <wp:docPr id="1866844344" name="Picture 7"/>
             <wp:cNvGraphicFramePr>
               <a:graphicFrameLocks xmlns:a="http://schemas.openxmlformats.org/drawingml/2006/main" noChangeAspect="1"/>
             </wp:cNvGraphicFramePr>
@@ -1218,7 +1289,7 @@
               <a:graphicData uri="http://schemas.openxmlformats.org/drawingml/2006/picture">
                 <pic:pic xmlns:pic="http://schemas.openxmlformats.org/drawingml/2006/picture">
                   <pic:nvPicPr>
-                    <pic:cNvPr id="266630881" name=""/>
+                    <pic:cNvPr id="1866844344" name=""/>
                     <pic:cNvPicPr/>
                   </pic:nvPicPr>
                   <pic:blipFill>
@@ -1327,6 +1398,7 @@
         <w:pStyle w:val="ListBullet"/>
       </w:pPr>
       <w:r>
+        <w:lastRenderedPageBreak/>
         <w:t>Sidechain  -  the same source, amount, attack and release as a channel. A bus can duck from any layer and from any earlier bus (Bus 2 can use Bus 1; Bus 3 can use Bus 1 and Bus 2), never from itself or a later bus.</w:t>
       </w:r>
     </w:p>
@@ -1351,7 +1423,6 @@
         <w:pStyle w:val="ListBullet"/>
       </w:pPr>
       <w:r>
-        <w:lastRenderedPageBreak/>
         <w:t>Insert 1 and Insert 2  -  two insert effects, in that order, with the same list of algorithms and four knobs each as the Master inserts.</w:t>
       </w:r>
     </w:p>
@@ -1369,10 +1440,10 @@
           <w:noProof/>
         </w:rPr>
         <w:drawing>
-          <wp:inline distT="0" distB="0" distL="0" distR="0" wp14:anchorId="3676D67A" wp14:editId="3E5A66E5">
+          <wp:inline distT="0" distB="0" distL="0" distR="0" wp14:anchorId="4928CBE4" wp14:editId="3747B97B">
             <wp:extent cx="5274310" cy="3921760"/>
             <wp:effectExtent l="0" t="0" r="2540" b="2540"/>
-            <wp:docPr id="1376249145" name="Picture 8"/>
+            <wp:docPr id="1869466102" name="Picture 8"/>
             <wp:cNvGraphicFramePr>
               <a:graphicFrameLocks xmlns:a="http://schemas.openxmlformats.org/drawingml/2006/main" noChangeAspect="1"/>
             </wp:cNvGraphicFramePr>
@@ -1380,7 +1451,7 @@
               <a:graphicData uri="http://schemas.openxmlformats.org/drawingml/2006/picture">
                 <pic:pic xmlns:pic="http://schemas.openxmlformats.org/drawingml/2006/picture">
                   <pic:nvPicPr>
-                    <pic:cNvPr id="1376249145" name=""/>
+                    <pic:cNvPr id="1869466102" name=""/>
                     <pic:cNvPicPr/>
                   </pic:nvPicPr>
                   <pic:blipFill>
@@ -1429,10 +1500,10 @@
         </w:rPr>
         <w:lastRenderedPageBreak/>
         <w:drawing>
-          <wp:inline distT="0" distB="0" distL="0" distR="0" wp14:anchorId="53E0945D" wp14:editId="10129C10">
+          <wp:inline distT="0" distB="0" distL="0" distR="0" wp14:anchorId="56F9E927" wp14:editId="497C53B5">
             <wp:extent cx="5274310" cy="3921760"/>
             <wp:effectExtent l="0" t="0" r="2540" b="2540"/>
-            <wp:docPr id="1585196116" name="Picture 9"/>
+            <wp:docPr id="1225363413" name="Picture 9"/>
             <wp:cNvGraphicFramePr>
               <a:graphicFrameLocks xmlns:a="http://schemas.openxmlformats.org/drawingml/2006/main" noChangeAspect="1"/>
             </wp:cNvGraphicFramePr>
@@ -1440,7 +1511,7 @@
               <a:graphicData uri="http://schemas.openxmlformats.org/drawingml/2006/picture">
                 <pic:pic xmlns:pic="http://schemas.openxmlformats.org/drawingml/2006/picture">
                   <pic:nvPicPr>
-                    <pic:cNvPr id="1585196116" name=""/>
+                    <pic:cNvPr id="1225363413" name=""/>
                     <pic:cNvPicPr/>
                   </pic:nvPicPr>
                   <pic:blipFill>
@@ -1774,10 +1845,10 @@
           <w:noProof/>
         </w:rPr>
         <w:drawing>
-          <wp:inline distT="0" distB="0" distL="0" distR="0" wp14:anchorId="643F176A" wp14:editId="4176C6F0">
+          <wp:inline distT="0" distB="0" distL="0" distR="0" wp14:anchorId="2CBF9AAF" wp14:editId="74037BA0">
             <wp:extent cx="5274310" cy="162560"/>
             <wp:effectExtent l="0" t="0" r="2540" b="8890"/>
-            <wp:docPr id="239821392" name="Picture 10"/>
+            <wp:docPr id="1017151121" name="Picture 10"/>
             <wp:cNvGraphicFramePr>
               <a:graphicFrameLocks xmlns:a="http://schemas.openxmlformats.org/drawingml/2006/main" noChangeAspect="1"/>
             </wp:cNvGraphicFramePr>
@@ -1785,7 +1856,7 @@
               <a:graphicData uri="http://schemas.openxmlformats.org/drawingml/2006/picture">
                 <pic:pic xmlns:pic="http://schemas.openxmlformats.org/drawingml/2006/picture">
                   <pic:nvPicPr>
-                    <pic:cNvPr id="239821392" name=""/>
+                    <pic:cNvPr id="1017151121" name=""/>
                     <pic:cNvPicPr/>
                   </pic:nvPicPr>
                   <pic:blipFill>
@@ -1871,6 +1942,14 @@
         <w:pStyle w:val="ListBullet"/>
       </w:pPr>
       <w:r>
+        <w:t>Clips, Auto-save clip edits  -  a tick box, ticked by default. Whether edits to a playing clip are saved into it (see Clips).</w:t>
+      </w:r>
+    </w:p>
+    <w:p>
+      <w:pPr>
+        <w:pStyle w:val="ListBullet"/>
+      </w:pPr>
+      <w:r>
         <w:t>Updates, Check for updates  -  a tick box. When ticked, mu-Tronic asks the transwarp.me website once a day for the latest version number and shows an Update available link in the status bar when there is a newer one. It sends nothing about you. Untick to switch the check off.</w:t>
       </w:r>
     </w:p>
@@ -1896,11 +1975,8 @@
       </w:r>
     </w:p>
     <w:p>
-      <w:pPr>
-        <w:pStyle w:val="ListBullet"/>
-      </w:pPr>
-      <w:r>
-        <w:t>Controller  -  connects a Launchpad (see Launchpad).</w:t>
+      <w:r>
+        <w:t>At the foot of Settings, Contact Support opens the support page in your web browser.</w:t>
       </w:r>
     </w:p>
     <w:p>
@@ -1913,25 +1989,57 @@
         <w:pStyle w:val="Heading1"/>
       </w:pPr>
       <w:r>
-        <w:t>13. Launchpad</w:t>
-      </w:r>
-    </w:p>
-    <w:p>
-      <w:r>
-        <w:t>mu-Tronic is designed to be played from a Novation Launchpad X as well as from the screen. The Launchpad's controller support is still being finished for mu-Tronic and has not yet been confirmed on real hardware, so treat the following as planned rather than promised.</w:t>
-      </w:r>
-    </w:p>
-    <w:p>
-      <w:pPr>
-        <w:pStyle w:val="ListBullet"/>
-      </w:pPr>
-      <w:r>
-        <w:t>Planned: hold the Launchpad's logo button and press any pad in a column to launch that scene, the same as clicking a Scene pad. While the logo is held, the pads show the scenes as white columns.</w:t>
-      </w:r>
-    </w:p>
-    <w:p>
-      <w:r>
-        <w:t>Connect and disconnect the Launchpad from the Controller line in Settings.</w:t>
+        <w:t>13. Connecting to mu-link</w:t>
+      </w:r>
+    </w:p>
+    <w:p>
+      <w:r>
+        <w:t>mu-link is a companion application from Transwarp Development Project: a local audio hub and master clock for the mu family. When mu-link is running, mu-Tronic connects to it automatically. Its audio is summed into mu-link's mix and its transport locks to mu-link's master clock.</w:t>
+      </w:r>
+    </w:p>
+    <w:p>
+      <w:pPr>
+        <w:pStyle w:val="Heading2"/>
+      </w:pPr>
+      <w:r>
+        <w:t>How to Connect</w:t>
+      </w:r>
+    </w:p>
+    <w:p>
+      <w:pPr>
+        <w:pStyle w:val="ListBullet"/>
+      </w:pPr>
+      <w:r>
+        <w:t>Launch mu-link, then launch mu-Tronic, in either order. Within about a second the mu-Tronic title bar shows mu-link connected.</w:t>
+      </w:r>
+    </w:p>
+    <w:p>
+      <w:pPr>
+        <w:pStyle w:val="ListBullet"/>
+      </w:pPr>
+      <w:r>
+        <w:t>mu-Tronic's audio plays through mu-link's output device, summed with any other connected mu apps.</w:t>
+      </w:r>
+    </w:p>
+    <w:p>
+      <w:pPr>
+        <w:pStyle w:val="ListBullet"/>
+      </w:pPr>
+      <w:r>
+        <w:t>mu-link is the tempo master. Use mu-link's Play/Stop and tempo while connected.</w:t>
+      </w:r>
+    </w:p>
+    <w:p>
+      <w:pPr>
+        <w:pStyle w:val="ListBullet"/>
+      </w:pPr>
+      <w:r>
+        <w:t>Quit mu-link and mu-Tronic reverts to its own audio device and internal transport, with no restart.</w:t>
+      </w:r>
+    </w:p>
+    <w:p>
+      <w:r>
+        <w:t>Because mu-Tronic holds up to sixteen layers itself, you often do not need mu-link at all. Use mu-link when you want to combine mu-Tronic with other apps or with outboard gear. See the mu-link User Manual for the full picture.</w:t>
       </w:r>
     </w:p>
     <w:p>
@@ -1939,57 +2047,63 @@
         <w:pStyle w:val="Heading1"/>
       </w:pPr>
       <w:r>
-        <w:t>14. Connecting to mu-link</w:t>
-      </w:r>
-    </w:p>
-    <w:p>
-      <w:r>
-        <w:t>mu-link is a companion application from Transwarp Development Project: a local audio hub and master clock for the mu family. When mu-link is running, mu-Tronic connects to it automatically. Its audio is summed into mu-link's mix and its transport locks to mu-link's master clock.</w:t>
-      </w:r>
-    </w:p>
-    <w:p>
-      <w:pPr>
-        <w:pStyle w:val="Heading2"/>
-      </w:pPr>
-      <w:r>
-        <w:t>How to Connect</w:t>
-      </w:r>
-    </w:p>
-    <w:p>
-      <w:pPr>
-        <w:pStyle w:val="ListBullet"/>
-      </w:pPr>
-      <w:r>
-        <w:t>Launch mu-link, then launch mu-Tronic, in either order. Within about a second the mu-Tronic title bar shows mu-link connected.</w:t>
-      </w:r>
-    </w:p>
-    <w:p>
-      <w:pPr>
-        <w:pStyle w:val="ListBullet"/>
-      </w:pPr>
-      <w:r>
-        <w:t>mu-Tronic's audio plays through mu-link's output device, summed with any other connected mu apps.</w:t>
-      </w:r>
-    </w:p>
-    <w:p>
-      <w:pPr>
-        <w:pStyle w:val="ListBullet"/>
-      </w:pPr>
-      <w:r>
-        <w:t>mu-link is the tempo master. Use mu-link's Play/Stop and tempo while connected.</w:t>
-      </w:r>
-    </w:p>
-    <w:p>
-      <w:pPr>
-        <w:pStyle w:val="ListBullet"/>
-      </w:pPr>
-      <w:r>
-        <w:t>Quit mu-link and mu-Tronic reverts to its own audio device and internal transport, with no restart.</w:t>
-      </w:r>
-    </w:p>
-    <w:p>
-      <w:r>
-        <w:t>Because mu-Tronic holds up to sixteen layers itself, you often do not need mu-link at all. Use mu-link when you want to combine mu-Tronic with other apps or with outboard gear. See the mu-link User Manual for the full picture.</w:t>
+        <w:t>14. Tips and Workflow</w:t>
+      </w:r>
+    </w:p>
+    <w:p>
+      <w:pPr>
+        <w:pStyle w:val="ListBullet"/>
+      </w:pPr>
+      <w:r>
+        <w:t>Starting out: add a Kick to slot 1 and a Bass to slot 2, press Play, and turn on a few steps.</w:t>
+      </w:r>
+    </w:p>
+    <w:p>
+      <w:pPr>
+        <w:pStyle w:val="ListBullet"/>
+      </w:pPr>
+      <w:r>
+        <w:t>Rumble: add a Kick, then a Rumble, which listens to the Kick by default.</w:t>
+      </w:r>
+    </w:p>
+    <w:p>
+      <w:pPr>
+        <w:pStyle w:val="ListBullet"/>
+      </w:pPr>
+      <w:r>
+        <w:t>Group the drums: send the Kick, Hat and Snare to Bus 1 and put a Compressor in Bus 1's Insert 1 to glue them.</w:t>
+      </w:r>
+    </w:p>
+    <w:p>
+      <w:pPr>
+        <w:pStyle w:val="ListBullet"/>
+      </w:pPr>
+      <w:r>
+        <w:t>Pump the bass: in the Bass layer's channel strip, set the sidechain source to your Kick.</w:t>
+      </w:r>
+    </w:p>
+    <w:p>
+      <w:pPr>
+        <w:pStyle w:val="ListBullet"/>
+      </w:pPr>
+      <w:r>
+        <w:t>Prepare variations: store clip 1 on every layer as your first section, change things, and store clip 2. Then use the Scene pads to switch the whole set at the next bar.</w:t>
+      </w:r>
+    </w:p>
+    <w:p>
+      <w:pPr>
+        <w:pStyle w:val="ListBullet"/>
+      </w:pPr>
+      <w:r>
+        <w:t>Bring in an old idea: use Import product preset to pull a whole mu-Clid or mu-On preset into the free slots.</w:t>
+      </w:r>
+    </w:p>
+    <w:p>
+      <w:pPr>
+        <w:pStyle w:val="ListBullet"/>
+      </w:pPr>
+      <w:r>
+        <w:t>Keep an eye on the CPU readout as you add layers.</w:t>
       </w:r>
     </w:p>
     <w:p>
@@ -1997,79 +2111,15 @@
         <w:pStyle w:val="Heading1"/>
       </w:pPr>
       <w:r>
-        <w:t>15. Tips and Workflow</w:t>
-      </w:r>
-    </w:p>
-    <w:p>
-      <w:pPr>
-        <w:pStyle w:val="ListBullet"/>
-      </w:pPr>
-      <w:r>
-        <w:t>Starting out: add a Kick to slot 1 and a Bass to slot 2, press Play, and turn on a few steps.</w:t>
-      </w:r>
-    </w:p>
-    <w:p>
-      <w:pPr>
-        <w:pStyle w:val="ListBullet"/>
-      </w:pPr>
-      <w:r>
-        <w:t>Rumble: add a Kick, then a Rumble, which listens to the Kick by default.</w:t>
-      </w:r>
-    </w:p>
-    <w:p>
-      <w:pPr>
-        <w:pStyle w:val="ListBullet"/>
-      </w:pPr>
-      <w:r>
-        <w:t>Group the drums: send the Kick, Hat and Snare to Bus 1 and put a Compressor in Bus 1's Insert 1 to glue them.</w:t>
-      </w:r>
-    </w:p>
-    <w:p>
-      <w:pPr>
-        <w:pStyle w:val="ListBullet"/>
-      </w:pPr>
-      <w:r>
-        <w:t>Pump the bass: in the Bass layer's channel strip, set the sidechain source to your Kick.</w:t>
-      </w:r>
-    </w:p>
-    <w:p>
-      <w:pPr>
-        <w:pStyle w:val="ListBullet"/>
-      </w:pPr>
-      <w:r>
-        <w:t>Prepare variations: store clip 1 on every layer as your first section, change things, and store clip 2. Then use the Scene pads to switch the whole set at the next bar.</w:t>
-      </w:r>
-    </w:p>
-    <w:p>
-      <w:pPr>
-        <w:pStyle w:val="ListBullet"/>
-      </w:pPr>
-      <w:r>
-        <w:t>Bring in an old idea: use Import product preset to pull a whole mu-Clid or mu-On preset into the free slots.</w:t>
-      </w:r>
-    </w:p>
-    <w:p>
-      <w:pPr>
-        <w:pStyle w:val="ListBullet"/>
-      </w:pPr>
-      <w:r>
-        <w:t>Keep an eye on the CPU readout as you add layers.</w:t>
-      </w:r>
-    </w:p>
-    <w:p>
-      <w:pPr>
-        <w:pStyle w:val="Heading1"/>
-      </w:pPr>
-      <w:r>
-        <w:t>16. Technical Specifications</w:t>
-      </w:r>
-    </w:p>
-    <w:p>
-      <w:pPr>
-        <w:pStyle w:val="ListBullet"/>
-      </w:pPr>
-      <w:r>
-        <w:t>Format: Standalone (Windows). No VST3 or CLAP. Free; no licence key.</w:t>
+        <w:t>15. Technical Specifications</w:t>
+      </w:r>
+    </w:p>
+    <w:p>
+      <w:pPr>
+        <w:pStyle w:val="ListBullet"/>
+      </w:pPr>
+      <w:r>
+        <w:t>Format: Standalone (Windows). No VST3 or CLAP. Pay What You Want; every feature works with or without a key.</w:t>
       </w:r>
     </w:p>
     <w:p>
@@ -2085,7 +2135,7 @@
         <w:pStyle w:val="ListBullet"/>
       </w:pPr>
       <w:r>
-        <w:t>Layer types: Rhythm, Pattern, Arp, Kick, Bass, Hat, Snare, Rumble</w:t>
+        <w:t>Layer types: Rhythm, Pattern, Arp, Kick, Bass, Hat, Snare, Rumble, FM Perc, Chord</w:t>
       </w:r>
     </w:p>
     <w:p>
@@ -2109,7 +2159,7 @@
         <w:pStyle w:val="ListBullet"/>
       </w:pPr>
       <w:r>
-        <w:t>Clips: 8 per layer (none for Rumble); scenes 1 to 8</w:t>
+        <w:t>Clips: 8 per layer (none for Rumble), with copy, cut, paste and auto-save; scenes 1 to 8</w:t>
       </w:r>
     </w:p>
     <w:p>
@@ -2164,7 +2214,7 @@
   <w:abstractNum w:abstractNumId="0" w15:restartNumberingAfterBreak="0">
     <w:nsid w:val="FFFFFF89"/>
     <w:multiLevelType w:val="singleLevel"/>
-    <w:tmpl w:val="F3FEDD44"/>
+    <w:tmpl w:val="B804E76C"/>
     <w:lvl w:ilvl="0">
       <w:start w:val="1"/>
       <w:numFmt w:val="bullet"/>
@@ -2182,7 +2232,7 @@
       </w:rPr>
     </w:lvl>
   </w:abstractNum>
-  <w:num w:numId="1" w16cid:durableId="8918029">
+  <w:num w:numId="1" w16cid:durableId="1439595760">
     <w:abstractNumId w:val="0"/>
   </w:num>
 </w:numbering>
@@ -2596,7 +2646,7 @@
     <w:link w:val="Heading1Char"/>
     <w:uiPriority w:val="9"/>
     <w:qFormat/>
-    <w:rsid w:val="005610F8"/>
+    <w:rsid w:val="00527527"/>
     <w:pPr>
       <w:keepNext/>
       <w:keepLines/>
@@ -2618,7 +2668,7 @@
     <w:uiPriority w:val="9"/>
     <w:unhideWhenUsed/>
     <w:qFormat/>
-    <w:rsid w:val="005610F8"/>
+    <w:rsid w:val="00527527"/>
     <w:pPr>
       <w:keepNext/>
       <w:keepLines/>
@@ -2640,7 +2690,7 @@
     <w:uiPriority w:val="9"/>
     <w:unhideWhenUsed/>
     <w:qFormat/>
-    <w:rsid w:val="005610F8"/>
+    <w:rsid w:val="00527527"/>
     <w:pPr>
       <w:keepNext/>
       <w:keepLines/>
@@ -2663,7 +2713,7 @@
     <w:semiHidden/>
     <w:unhideWhenUsed/>
     <w:qFormat/>
-    <w:rsid w:val="005610F8"/>
+    <w:rsid w:val="00527527"/>
     <w:pPr>
       <w:keepNext/>
       <w:keepLines/>
@@ -2686,7 +2736,7 @@
     <w:semiHidden/>
     <w:unhideWhenUsed/>
     <w:qFormat/>
-    <w:rsid w:val="005610F8"/>
+    <w:rsid w:val="00527527"/>
     <w:pPr>
       <w:keepNext/>
       <w:keepLines/>
@@ -2707,7 +2757,7 @@
     <w:semiHidden/>
     <w:unhideWhenUsed/>
     <w:qFormat/>
-    <w:rsid w:val="005610F8"/>
+    <w:rsid w:val="00527527"/>
     <w:pPr>
       <w:keepNext/>
       <w:keepLines/>
@@ -2730,7 +2780,7 @@
     <w:semiHidden/>
     <w:unhideWhenUsed/>
     <w:qFormat/>
-    <w:rsid w:val="005610F8"/>
+    <w:rsid w:val="00527527"/>
     <w:pPr>
       <w:keepNext/>
       <w:keepLines/>
@@ -2751,7 +2801,7 @@
     <w:semiHidden/>
     <w:unhideWhenUsed/>
     <w:qFormat/>
-    <w:rsid w:val="005610F8"/>
+    <w:rsid w:val="00527527"/>
     <w:pPr>
       <w:keepNext/>
       <w:keepLines/>
@@ -2774,7 +2824,7 @@
     <w:semiHidden/>
     <w:unhideWhenUsed/>
     <w:qFormat/>
-    <w:rsid w:val="005610F8"/>
+    <w:rsid w:val="00527527"/>
     <w:pPr>
       <w:keepNext/>
       <w:keepLines/>
@@ -2818,7 +2868,7 @@
     <w:basedOn w:val="DefaultParagraphFont"/>
     <w:link w:val="Heading1"/>
     <w:uiPriority w:val="9"/>
-    <w:rsid w:val="005610F8"/>
+    <w:rsid w:val="00527527"/>
     <w:rPr>
       <w:rFonts w:asciiTheme="majorHAnsi" w:eastAsiaTheme="majorEastAsia" w:hAnsiTheme="majorHAnsi" w:cstheme="majorBidi"/>
       <w:color w:val="0F4761" w:themeColor="accent1" w:themeShade="BF"/>
@@ -2831,7 +2881,7 @@
     <w:basedOn w:val="DefaultParagraphFont"/>
     <w:link w:val="Heading2"/>
     <w:uiPriority w:val="9"/>
-    <w:rsid w:val="005610F8"/>
+    <w:rsid w:val="00527527"/>
     <w:rPr>
       <w:rFonts w:asciiTheme="majorHAnsi" w:eastAsiaTheme="majorEastAsia" w:hAnsiTheme="majorHAnsi" w:cstheme="majorBidi"/>
       <w:color w:val="0F4761" w:themeColor="accent1" w:themeShade="BF"/>
@@ -2844,7 +2894,7 @@
     <w:basedOn w:val="DefaultParagraphFont"/>
     <w:link w:val="Heading3"/>
     <w:uiPriority w:val="9"/>
-    <w:rsid w:val="005610F8"/>
+    <w:rsid w:val="00527527"/>
     <w:rPr>
       <w:rFonts w:eastAsiaTheme="majorEastAsia" w:cstheme="majorBidi"/>
       <w:color w:val="0F4761" w:themeColor="accent1" w:themeShade="BF"/>
@@ -2858,7 +2908,7 @@
     <w:link w:val="Heading4"/>
     <w:uiPriority w:val="9"/>
     <w:semiHidden/>
-    <w:rsid w:val="005610F8"/>
+    <w:rsid w:val="00527527"/>
     <w:rPr>
       <w:rFonts w:eastAsiaTheme="majorEastAsia" w:cstheme="majorBidi"/>
       <w:i/>
@@ -2872,7 +2922,7 @@
     <w:link w:val="Heading5"/>
     <w:uiPriority w:val="9"/>
     <w:semiHidden/>
-    <w:rsid w:val="005610F8"/>
+    <w:rsid w:val="00527527"/>
     <w:rPr>
       <w:rFonts w:eastAsiaTheme="majorEastAsia" w:cstheme="majorBidi"/>
       <w:color w:val="0F4761" w:themeColor="accent1" w:themeShade="BF"/>
@@ -2884,7 +2934,7 @@
     <w:link w:val="Heading6"/>
     <w:uiPriority w:val="9"/>
     <w:semiHidden/>
-    <w:rsid w:val="005610F8"/>
+    <w:rsid w:val="00527527"/>
     <w:rPr>
       <w:rFonts w:eastAsiaTheme="majorEastAsia" w:cstheme="majorBidi"/>
       <w:i/>
@@ -2898,7 +2948,7 @@
     <w:link w:val="Heading7"/>
     <w:uiPriority w:val="9"/>
     <w:semiHidden/>
-    <w:rsid w:val="005610F8"/>
+    <w:rsid w:val="00527527"/>
     <w:rPr>
       <w:rFonts w:eastAsiaTheme="majorEastAsia" w:cstheme="majorBidi"/>
       <w:color w:val="595959" w:themeColor="text1" w:themeTint="A6"/>
@@ -2910,7 +2960,7 @@
     <w:link w:val="Heading8"/>
     <w:uiPriority w:val="9"/>
     <w:semiHidden/>
-    <w:rsid w:val="005610F8"/>
+    <w:rsid w:val="00527527"/>
     <w:rPr>
       <w:rFonts w:eastAsiaTheme="majorEastAsia" w:cstheme="majorBidi"/>
       <w:i/>
@@ -2924,7 +2974,7 @@
     <w:link w:val="Heading9"/>
     <w:uiPriority w:val="9"/>
     <w:semiHidden/>
-    <w:rsid w:val="005610F8"/>
+    <w:rsid w:val="00527527"/>
     <w:rPr>
       <w:rFonts w:eastAsiaTheme="majorEastAsia" w:cstheme="majorBidi"/>
       <w:color w:val="272727" w:themeColor="text1" w:themeTint="D8"/>
@@ -2937,7 +2987,7 @@
     <w:link w:val="TitleChar"/>
     <w:uiPriority w:val="10"/>
     <w:qFormat/>
-    <w:rsid w:val="005610F8"/>
+    <w:rsid w:val="00527527"/>
     <w:pPr>
       <w:spacing w:after="80" w:line="240" w:lineRule="auto"/>
       <w:contextualSpacing/>
@@ -2955,7 +3005,7 @@
     <w:basedOn w:val="DefaultParagraphFont"/>
     <w:link w:val="Title"/>
     <w:uiPriority w:val="10"/>
-    <w:rsid w:val="005610F8"/>
+    <w:rsid w:val="00527527"/>
     <w:rPr>
       <w:rFonts w:asciiTheme="majorHAnsi" w:eastAsiaTheme="majorEastAsia" w:hAnsiTheme="majorHAnsi" w:cstheme="majorBidi"/>
       <w:spacing w:val="-10"/>
@@ -2971,7 +3021,7 @@
     <w:link w:val="SubtitleChar"/>
     <w:uiPriority w:val="11"/>
     <w:qFormat/>
-    <w:rsid w:val="005610F8"/>
+    <w:rsid w:val="00527527"/>
     <w:pPr>
       <w:numPr>
         <w:ilvl w:val="1"/>
@@ -2990,7 +3040,7 @@
     <w:basedOn w:val="DefaultParagraphFont"/>
     <w:link w:val="Subtitle"/>
     <w:uiPriority w:val="11"/>
-    <w:rsid w:val="005610F8"/>
+    <w:rsid w:val="00527527"/>
     <w:rPr>
       <w:rFonts w:eastAsiaTheme="majorEastAsia" w:cstheme="majorBidi"/>
       <w:color w:val="595959" w:themeColor="text1" w:themeTint="A6"/>
@@ -3006,7 +3056,7 @@
     <w:link w:val="QuoteChar"/>
     <w:uiPriority w:val="29"/>
     <w:qFormat/>
-    <w:rsid w:val="005610F8"/>
+    <w:rsid w:val="00527527"/>
     <w:pPr>
       <w:spacing w:before="160"/>
       <w:jc w:val="center"/>
@@ -3022,7 +3072,7 @@
     <w:basedOn w:val="DefaultParagraphFont"/>
     <w:link w:val="Quote"/>
     <w:uiPriority w:val="29"/>
-    <w:rsid w:val="005610F8"/>
+    <w:rsid w:val="00527527"/>
     <w:rPr>
       <w:i/>
       <w:iCs/>
@@ -3034,7 +3084,7 @@
     <w:basedOn w:val="Normal"/>
     <w:uiPriority w:val="34"/>
     <w:qFormat/>
-    <w:rsid w:val="005610F8"/>
+    <w:rsid w:val="00527527"/>
     <w:pPr>
       <w:ind w:left="720"/>
       <w:contextualSpacing/>
@@ -3045,7 +3095,7 @@
     <w:basedOn w:val="DefaultParagraphFont"/>
     <w:uiPriority w:val="21"/>
     <w:qFormat/>
-    <w:rsid w:val="005610F8"/>
+    <w:rsid w:val="00527527"/>
     <w:rPr>
       <w:i/>
       <w:iCs/>
@@ -3059,7 +3109,7 @@
     <w:link w:val="IntenseQuoteChar"/>
     <w:uiPriority w:val="30"/>
     <w:qFormat/>
-    <w:rsid w:val="005610F8"/>
+    <w:rsid w:val="00527527"/>
     <w:pPr>
       <w:pBdr>
         <w:top w:val="single" w:sz="4" w:space="10" w:color="0F4761" w:themeColor="accent1" w:themeShade="BF"/>
@@ -3080,7 +3130,7 @@
     <w:basedOn w:val="DefaultParagraphFont"/>
     <w:link w:val="IntenseQuote"/>
     <w:uiPriority w:val="30"/>
-    <w:rsid w:val="005610F8"/>
+    <w:rsid w:val="00527527"/>
     <w:rPr>
       <w:i/>
       <w:iCs/>
@@ -3092,7 +3142,7 @@
     <w:basedOn w:val="DefaultParagraphFont"/>
     <w:uiPriority w:val="32"/>
     <w:qFormat/>
-    <w:rsid w:val="005610F8"/>
+    <w:rsid w:val="00527527"/>
     <w:rPr>
       <w:b/>
       <w:bCs/>
@@ -3106,7 +3156,7 @@
     <w:basedOn w:val="Normal"/>
     <w:uiPriority w:val="99"/>
     <w:unhideWhenUsed/>
-    <w:rsid w:val="005610F8"/>
+    <w:rsid w:val="00527527"/>
     <w:pPr>
       <w:numPr>
         <w:numId w:val="1"/>

</xml_diff>

<commit_message>
mu-Tronic: £25 suggested price (per-product in the support prompt); manual regenerated
Refs #1678: LicensingConfig.suggestedPrice (default 20) feeds the shell's support prompt; mu-Tronic passes 25; manual says £25 and plain Version 1.1

Version: v1.1.1451

Co-Authored-By: Claude Sonnet 5.5 <noreply@anthropic.com>
</commit_message>
<xml_diff>
--- a/docs/mu-tronic/mu-Tronic User Manual.docx
+++ b/docs/mu-tronic/mu-Tronic User Manual.docx
@@ -25,7 +25,7 @@
     </w:p>
     <w:p>
       <w:r>
-        <w:t>Version 1.1 (pre-release)</w:t>
+        <w:t>Version 1.1</w:t>
       </w:r>
     </w:p>
     <w:p>
@@ -49,7 +49,7 @@
     </w:p>
     <w:p>
       <w:r>
-        <w:t>mu-Tronic is a performance unit from Transwarp Development Project. It is a standalone application: there is no VST3 or CLAP version. mu-Tronic is Pay What You Want: pay what you like from £0 (suggested £20), and nothing is limited either way (see Supporting mu-Tronic).</w:t>
+        <w:t>mu-Tronic is a performance unit from Transwarp Development Project. It is a standalone application: there is no VST3 or CLAP version. mu-Tronic is Pay What You Want: pay what you like from £0 (suggested £25), and nothing is limited either way (see Supporting mu-Tronic).</w:t>
       </w:r>
     </w:p>
     <w:p>
@@ -130,10 +130,10 @@
         </w:rPr>
         <w:lastRenderedPageBreak/>
         <w:drawing>
-          <wp:inline distT="0" distB="0" distL="0" distR="0" wp14:anchorId="5947465A" wp14:editId="5791AF5D">
+          <wp:inline distT="0" distB="0" distL="0" distR="0" wp14:anchorId="140EAB5F" wp14:editId="725BF28F">
             <wp:extent cx="5274310" cy="3921760"/>
             <wp:effectExtent l="0" t="0" r="2540" b="2540"/>
-            <wp:docPr id="856824033" name="Picture 1"/>
+            <wp:docPr id="645663649" name="Picture 1"/>
             <wp:cNvGraphicFramePr>
               <a:graphicFrameLocks xmlns:a="http://schemas.openxmlformats.org/drawingml/2006/main" noChangeAspect="1"/>
             </wp:cNvGraphicFramePr>
@@ -141,7 +141,7 @@
               <a:graphicData uri="http://schemas.openxmlformats.org/drawingml/2006/picture">
                 <pic:pic xmlns:pic="http://schemas.openxmlformats.org/drawingml/2006/picture">
                   <pic:nvPicPr>
-                    <pic:cNvPr id="856824033" name=""/>
+                    <pic:cNvPr id="645663649" name=""/>
                     <pic:cNvPicPr/>
                   </pic:nvPicPr>
                   <pic:blipFill>
@@ -213,7 +213,7 @@
     </w:p>
     <w:p>
       <w:r>
-        <w:t>mu-Tronic is Pay What You Want. You choose what to pay, from £0 upwards (the suggested amount is £20), and nothing is limited either way: every feature works for everyone. Whatever you pay, even £0, you are sent a licence key by email from Lemon Squeezy, our payment provider. Entering the key removes the Support window. The key changes nothing else; mu-Tronic works the same with or without it.</w:t>
+        <w:t>mu-Tronic is Pay What You Want. You choose what to pay, from £0 upwards (the suggested amount is £25), and nothing is limited either way: every feature works for everyone. Whatever you pay, even £0, you are sent a licence key by email from Lemon Squeezy, our payment provider. Entering the key removes the Support window. The key changes nothing else; mu-Tronic works the same with or without it.</w:t>
       </w:r>
     </w:p>
     <w:p>
@@ -243,7 +243,7 @@
         <w:pStyle w:val="ListBullet"/>
       </w:pPr>
       <w:r>
-        <w:t>Pay what you like  -  opens the checkout page in your web browser. The suggested amount is £20, but £0 is fine. You receive a key either way.</w:t>
+        <w:t>Pay what you like  -  opens the checkout page in your web browser. The suggested amount is £25, but £0 is fine. You receive a key either way.</w:t>
       </w:r>
     </w:p>
     <w:p>
@@ -450,10 +450,10 @@
           <w:noProof/>
         </w:rPr>
         <w:drawing>
-          <wp:inline distT="0" distB="0" distL="0" distR="0" wp14:anchorId="4B109D0B" wp14:editId="081EC53E">
+          <wp:inline distT="0" distB="0" distL="0" distR="0" wp14:anchorId="4854B54C" wp14:editId="0D55C202">
             <wp:extent cx="5274310" cy="162560"/>
             <wp:effectExtent l="0" t="0" r="2540" b="8890"/>
-            <wp:docPr id="210572567" name="Picture 2"/>
+            <wp:docPr id="89594601" name="Picture 2"/>
             <wp:cNvGraphicFramePr>
               <a:graphicFrameLocks xmlns:a="http://schemas.openxmlformats.org/drawingml/2006/main" noChangeAspect="1"/>
             </wp:cNvGraphicFramePr>
@@ -461,7 +461,7 @@
               <a:graphicData uri="http://schemas.openxmlformats.org/drawingml/2006/picture">
                 <pic:pic xmlns:pic="http://schemas.openxmlformats.org/drawingml/2006/picture">
                   <pic:nvPicPr>
-                    <pic:cNvPr id="210572567" name=""/>
+                    <pic:cNvPr id="89594601" name=""/>
                     <pic:cNvPicPr/>
                   </pic:nvPicPr>
                   <pic:blipFill>
@@ -571,10 +571,10 @@
           <w:noProof/>
         </w:rPr>
         <w:drawing>
-          <wp:inline distT="0" distB="0" distL="0" distR="0" wp14:anchorId="7F05999A" wp14:editId="2AB55110">
+          <wp:inline distT="0" distB="0" distL="0" distR="0" wp14:anchorId="13A4D56A" wp14:editId="1DEE6D84">
             <wp:extent cx="464963" cy="4318000"/>
             <wp:effectExtent l="0" t="0" r="0" b="6350"/>
-            <wp:docPr id="359522138" name="Picture 3"/>
+            <wp:docPr id="818782026" name="Picture 3"/>
             <wp:cNvGraphicFramePr>
               <a:graphicFrameLocks xmlns:a="http://schemas.openxmlformats.org/drawingml/2006/main" noChangeAspect="1"/>
             </wp:cNvGraphicFramePr>
@@ -582,7 +582,7 @@
               <a:graphicData uri="http://schemas.openxmlformats.org/drawingml/2006/picture">
                 <pic:pic xmlns:pic="http://schemas.openxmlformats.org/drawingml/2006/picture">
                   <pic:nvPicPr>
-                    <pic:cNvPr id="359522138" name=""/>
+                    <pic:cNvPr id="818782026" name=""/>
                     <pic:cNvPicPr/>
                   </pic:nvPicPr>
                   <pic:blipFill>
@@ -723,10 +723,10 @@
         </w:rPr>
         <w:lastRenderedPageBreak/>
         <w:drawing>
-          <wp:inline distT="0" distB="0" distL="0" distR="0" wp14:anchorId="265CB9C9" wp14:editId="70100F75">
+          <wp:inline distT="0" distB="0" distL="0" distR="0" wp14:anchorId="32DF6F55" wp14:editId="167C6E52">
             <wp:extent cx="5274310" cy="3921760"/>
             <wp:effectExtent l="0" t="0" r="2540" b="2540"/>
-            <wp:docPr id="1347997092" name="Picture 4"/>
+            <wp:docPr id="1024015717" name="Picture 4"/>
             <wp:cNvGraphicFramePr>
               <a:graphicFrameLocks xmlns:a="http://schemas.openxmlformats.org/drawingml/2006/main" noChangeAspect="1"/>
             </wp:cNvGraphicFramePr>
@@ -734,7 +734,7 @@
               <a:graphicData uri="http://schemas.openxmlformats.org/drawingml/2006/picture">
                 <pic:pic xmlns:pic="http://schemas.openxmlformats.org/drawingml/2006/picture">
                   <pic:nvPicPr>
-                    <pic:cNvPr id="1347997092" name=""/>
+                    <pic:cNvPr id="1024015717" name=""/>
                     <pic:cNvPicPr/>
                   </pic:nvPicPr>
                   <pic:blipFill>
@@ -1143,10 +1143,10 @@
           <w:noProof/>
         </w:rPr>
         <w:drawing>
-          <wp:inline distT="0" distB="0" distL="0" distR="0" wp14:anchorId="7E516AC2" wp14:editId="15699E7C">
+          <wp:inline distT="0" distB="0" distL="0" distR="0" wp14:anchorId="10FD8470" wp14:editId="520554B0">
             <wp:extent cx="1714500" cy="3238500"/>
             <wp:effectExtent l="0" t="0" r="0" b="0"/>
-            <wp:docPr id="510630831" name="Picture 5"/>
+            <wp:docPr id="950378041" name="Picture 5"/>
             <wp:cNvGraphicFramePr>
               <a:graphicFrameLocks xmlns:a="http://schemas.openxmlformats.org/drawingml/2006/main" noChangeAspect="1"/>
             </wp:cNvGraphicFramePr>
@@ -1154,7 +1154,7 @@
               <a:graphicData uri="http://schemas.openxmlformats.org/drawingml/2006/picture">
                 <pic:pic xmlns:pic="http://schemas.openxmlformats.org/drawingml/2006/picture">
                   <pic:nvPicPr>
-                    <pic:cNvPr id="510630831" name=""/>
+                    <pic:cNvPr id="950378041" name=""/>
                     <pic:cNvPicPr/>
                   </pic:nvPicPr>
                   <pic:blipFill>
@@ -1202,10 +1202,10 @@
           <w:noProof/>
         </w:rPr>
         <w:drawing>
-          <wp:inline distT="0" distB="0" distL="0" distR="0" wp14:anchorId="1D5ADA3F" wp14:editId="739A9DFA">
+          <wp:inline distT="0" distB="0" distL="0" distR="0" wp14:anchorId="3F94868D" wp14:editId="16EC5AB4">
             <wp:extent cx="5274310" cy="376555"/>
             <wp:effectExtent l="0" t="0" r="2540" b="4445"/>
-            <wp:docPr id="1278589023" name="Picture 6"/>
+            <wp:docPr id="1058901641" name="Picture 6"/>
             <wp:cNvGraphicFramePr>
               <a:graphicFrameLocks xmlns:a="http://schemas.openxmlformats.org/drawingml/2006/main" noChangeAspect="1"/>
             </wp:cNvGraphicFramePr>
@@ -1213,7 +1213,7 @@
               <a:graphicData uri="http://schemas.openxmlformats.org/drawingml/2006/picture">
                 <pic:pic xmlns:pic="http://schemas.openxmlformats.org/drawingml/2006/picture">
                   <pic:nvPicPr>
-                    <pic:cNvPr id="1278589023" name=""/>
+                    <pic:cNvPr id="1058901641" name=""/>
                     <pic:cNvPicPr/>
                   </pic:nvPicPr>
                   <pic:blipFill>
@@ -1278,10 +1278,10 @@
           <w:noProof/>
         </w:rPr>
         <w:drawing>
-          <wp:inline distT="0" distB="0" distL="0" distR="0" wp14:anchorId="21DB4ABE" wp14:editId="637E34BA">
+          <wp:inline distT="0" distB="0" distL="0" distR="0" wp14:anchorId="564944AA" wp14:editId="118F64CD">
             <wp:extent cx="5274310" cy="1626870"/>
             <wp:effectExtent l="0" t="0" r="2540" b="0"/>
-            <wp:docPr id="1866844344" name="Picture 7"/>
+            <wp:docPr id="1651816760" name="Picture 7"/>
             <wp:cNvGraphicFramePr>
               <a:graphicFrameLocks xmlns:a="http://schemas.openxmlformats.org/drawingml/2006/main" noChangeAspect="1"/>
             </wp:cNvGraphicFramePr>
@@ -1289,7 +1289,7 @@
               <a:graphicData uri="http://schemas.openxmlformats.org/drawingml/2006/picture">
                 <pic:pic xmlns:pic="http://schemas.openxmlformats.org/drawingml/2006/picture">
                   <pic:nvPicPr>
-                    <pic:cNvPr id="1866844344" name=""/>
+                    <pic:cNvPr id="1651816760" name=""/>
                     <pic:cNvPicPr/>
                   </pic:nvPicPr>
                   <pic:blipFill>
@@ -1440,10 +1440,10 @@
           <w:noProof/>
         </w:rPr>
         <w:drawing>
-          <wp:inline distT="0" distB="0" distL="0" distR="0" wp14:anchorId="4928CBE4" wp14:editId="3747B97B">
+          <wp:inline distT="0" distB="0" distL="0" distR="0" wp14:anchorId="05840D31" wp14:editId="15F0B33D">
             <wp:extent cx="5274310" cy="3921760"/>
             <wp:effectExtent l="0" t="0" r="2540" b="2540"/>
-            <wp:docPr id="1869466102" name="Picture 8"/>
+            <wp:docPr id="288398276" name="Picture 8"/>
             <wp:cNvGraphicFramePr>
               <a:graphicFrameLocks xmlns:a="http://schemas.openxmlformats.org/drawingml/2006/main" noChangeAspect="1"/>
             </wp:cNvGraphicFramePr>
@@ -1451,7 +1451,7 @@
               <a:graphicData uri="http://schemas.openxmlformats.org/drawingml/2006/picture">
                 <pic:pic xmlns:pic="http://schemas.openxmlformats.org/drawingml/2006/picture">
                   <pic:nvPicPr>
-                    <pic:cNvPr id="1869466102" name=""/>
+                    <pic:cNvPr id="288398276" name=""/>
                     <pic:cNvPicPr/>
                   </pic:nvPicPr>
                   <pic:blipFill>
@@ -1500,10 +1500,10 @@
         </w:rPr>
         <w:lastRenderedPageBreak/>
         <w:drawing>
-          <wp:inline distT="0" distB="0" distL="0" distR="0" wp14:anchorId="56F9E927" wp14:editId="497C53B5">
+          <wp:inline distT="0" distB="0" distL="0" distR="0" wp14:anchorId="0CC6FE8E" wp14:editId="3EF15EFF">
             <wp:extent cx="5274310" cy="3921760"/>
             <wp:effectExtent l="0" t="0" r="2540" b="2540"/>
-            <wp:docPr id="1225363413" name="Picture 9"/>
+            <wp:docPr id="1274422367" name="Picture 9"/>
             <wp:cNvGraphicFramePr>
               <a:graphicFrameLocks xmlns:a="http://schemas.openxmlformats.org/drawingml/2006/main" noChangeAspect="1"/>
             </wp:cNvGraphicFramePr>
@@ -1511,7 +1511,7 @@
               <a:graphicData uri="http://schemas.openxmlformats.org/drawingml/2006/picture">
                 <pic:pic xmlns:pic="http://schemas.openxmlformats.org/drawingml/2006/picture">
                   <pic:nvPicPr>
-                    <pic:cNvPr id="1225363413" name=""/>
+                    <pic:cNvPr id="1274422367" name=""/>
                     <pic:cNvPicPr/>
                   </pic:nvPicPr>
                   <pic:blipFill>
@@ -1845,10 +1845,10 @@
           <w:noProof/>
         </w:rPr>
         <w:drawing>
-          <wp:inline distT="0" distB="0" distL="0" distR="0" wp14:anchorId="2CBF9AAF" wp14:editId="74037BA0">
+          <wp:inline distT="0" distB="0" distL="0" distR="0" wp14:anchorId="46A4EE14" wp14:editId="0AA9F42F">
             <wp:extent cx="5274310" cy="162560"/>
             <wp:effectExtent l="0" t="0" r="2540" b="8890"/>
-            <wp:docPr id="1017151121" name="Picture 10"/>
+            <wp:docPr id="1178726373" name="Picture 10"/>
             <wp:cNvGraphicFramePr>
               <a:graphicFrameLocks xmlns:a="http://schemas.openxmlformats.org/drawingml/2006/main" noChangeAspect="1"/>
             </wp:cNvGraphicFramePr>
@@ -1856,7 +1856,7 @@
               <a:graphicData uri="http://schemas.openxmlformats.org/drawingml/2006/picture">
                 <pic:pic xmlns:pic="http://schemas.openxmlformats.org/drawingml/2006/picture">
                   <pic:nvPicPr>
-                    <pic:cNvPr id="1017151121" name=""/>
+                    <pic:cNvPr id="1178726373" name=""/>
                     <pic:cNvPicPr/>
                   </pic:nvPicPr>
                   <pic:blipFill>
@@ -2214,7 +2214,7 @@
   <w:abstractNum w:abstractNumId="0" w15:restartNumberingAfterBreak="0">
     <w:nsid w:val="FFFFFF89"/>
     <w:multiLevelType w:val="singleLevel"/>
-    <w:tmpl w:val="B804E76C"/>
+    <w:tmpl w:val="CCCA14E4"/>
     <w:lvl w:ilvl="0">
       <w:start w:val="1"/>
       <w:numFmt w:val="bullet"/>
@@ -2232,7 +2232,7 @@
       </w:rPr>
     </w:lvl>
   </w:abstractNum>
-  <w:num w:numId="1" w16cid:durableId="1439595760">
+  <w:num w:numId="1" w16cid:durableId="1644046667">
     <w:abstractNumId w:val="0"/>
   </w:num>
 </w:numbering>
@@ -2646,7 +2646,7 @@
     <w:link w:val="Heading1Char"/>
     <w:uiPriority w:val="9"/>
     <w:qFormat/>
-    <w:rsid w:val="00527527"/>
+    <w:rsid w:val="008250C1"/>
     <w:pPr>
       <w:keepNext/>
       <w:keepLines/>
@@ -2668,7 +2668,7 @@
     <w:uiPriority w:val="9"/>
     <w:unhideWhenUsed/>
     <w:qFormat/>
-    <w:rsid w:val="00527527"/>
+    <w:rsid w:val="008250C1"/>
     <w:pPr>
       <w:keepNext/>
       <w:keepLines/>
@@ -2690,7 +2690,7 @@
     <w:uiPriority w:val="9"/>
     <w:unhideWhenUsed/>
     <w:qFormat/>
-    <w:rsid w:val="00527527"/>
+    <w:rsid w:val="008250C1"/>
     <w:pPr>
       <w:keepNext/>
       <w:keepLines/>
@@ -2713,7 +2713,7 @@
     <w:semiHidden/>
     <w:unhideWhenUsed/>
     <w:qFormat/>
-    <w:rsid w:val="00527527"/>
+    <w:rsid w:val="008250C1"/>
     <w:pPr>
       <w:keepNext/>
       <w:keepLines/>
@@ -2736,7 +2736,7 @@
     <w:semiHidden/>
     <w:unhideWhenUsed/>
     <w:qFormat/>
-    <w:rsid w:val="00527527"/>
+    <w:rsid w:val="008250C1"/>
     <w:pPr>
       <w:keepNext/>
       <w:keepLines/>
@@ -2757,7 +2757,7 @@
     <w:semiHidden/>
     <w:unhideWhenUsed/>
     <w:qFormat/>
-    <w:rsid w:val="00527527"/>
+    <w:rsid w:val="008250C1"/>
     <w:pPr>
       <w:keepNext/>
       <w:keepLines/>
@@ -2780,7 +2780,7 @@
     <w:semiHidden/>
     <w:unhideWhenUsed/>
     <w:qFormat/>
-    <w:rsid w:val="00527527"/>
+    <w:rsid w:val="008250C1"/>
     <w:pPr>
       <w:keepNext/>
       <w:keepLines/>
@@ -2801,7 +2801,7 @@
     <w:semiHidden/>
     <w:unhideWhenUsed/>
     <w:qFormat/>
-    <w:rsid w:val="00527527"/>
+    <w:rsid w:val="008250C1"/>
     <w:pPr>
       <w:keepNext/>
       <w:keepLines/>
@@ -2824,7 +2824,7 @@
     <w:semiHidden/>
     <w:unhideWhenUsed/>
     <w:qFormat/>
-    <w:rsid w:val="00527527"/>
+    <w:rsid w:val="008250C1"/>
     <w:pPr>
       <w:keepNext/>
       <w:keepLines/>
@@ -2868,7 +2868,7 @@
     <w:basedOn w:val="DefaultParagraphFont"/>
     <w:link w:val="Heading1"/>
     <w:uiPriority w:val="9"/>
-    <w:rsid w:val="00527527"/>
+    <w:rsid w:val="008250C1"/>
     <w:rPr>
       <w:rFonts w:asciiTheme="majorHAnsi" w:eastAsiaTheme="majorEastAsia" w:hAnsiTheme="majorHAnsi" w:cstheme="majorBidi"/>
       <w:color w:val="0F4761" w:themeColor="accent1" w:themeShade="BF"/>
@@ -2881,7 +2881,7 @@
     <w:basedOn w:val="DefaultParagraphFont"/>
     <w:link w:val="Heading2"/>
     <w:uiPriority w:val="9"/>
-    <w:rsid w:val="00527527"/>
+    <w:rsid w:val="008250C1"/>
     <w:rPr>
       <w:rFonts w:asciiTheme="majorHAnsi" w:eastAsiaTheme="majorEastAsia" w:hAnsiTheme="majorHAnsi" w:cstheme="majorBidi"/>
       <w:color w:val="0F4761" w:themeColor="accent1" w:themeShade="BF"/>
@@ -2894,7 +2894,7 @@
     <w:basedOn w:val="DefaultParagraphFont"/>
     <w:link w:val="Heading3"/>
     <w:uiPriority w:val="9"/>
-    <w:rsid w:val="00527527"/>
+    <w:rsid w:val="008250C1"/>
     <w:rPr>
       <w:rFonts w:eastAsiaTheme="majorEastAsia" w:cstheme="majorBidi"/>
       <w:color w:val="0F4761" w:themeColor="accent1" w:themeShade="BF"/>
@@ -2908,7 +2908,7 @@
     <w:link w:val="Heading4"/>
     <w:uiPriority w:val="9"/>
     <w:semiHidden/>
-    <w:rsid w:val="00527527"/>
+    <w:rsid w:val="008250C1"/>
     <w:rPr>
       <w:rFonts w:eastAsiaTheme="majorEastAsia" w:cstheme="majorBidi"/>
       <w:i/>
@@ -2922,7 +2922,7 @@
     <w:link w:val="Heading5"/>
     <w:uiPriority w:val="9"/>
     <w:semiHidden/>
-    <w:rsid w:val="00527527"/>
+    <w:rsid w:val="008250C1"/>
     <w:rPr>
       <w:rFonts w:eastAsiaTheme="majorEastAsia" w:cstheme="majorBidi"/>
       <w:color w:val="0F4761" w:themeColor="accent1" w:themeShade="BF"/>
@@ -2934,7 +2934,7 @@
     <w:link w:val="Heading6"/>
     <w:uiPriority w:val="9"/>
     <w:semiHidden/>
-    <w:rsid w:val="00527527"/>
+    <w:rsid w:val="008250C1"/>
     <w:rPr>
       <w:rFonts w:eastAsiaTheme="majorEastAsia" w:cstheme="majorBidi"/>
       <w:i/>
@@ -2948,7 +2948,7 @@
     <w:link w:val="Heading7"/>
     <w:uiPriority w:val="9"/>
     <w:semiHidden/>
-    <w:rsid w:val="00527527"/>
+    <w:rsid w:val="008250C1"/>
     <w:rPr>
       <w:rFonts w:eastAsiaTheme="majorEastAsia" w:cstheme="majorBidi"/>
       <w:color w:val="595959" w:themeColor="text1" w:themeTint="A6"/>
@@ -2960,7 +2960,7 @@
     <w:link w:val="Heading8"/>
     <w:uiPriority w:val="9"/>
     <w:semiHidden/>
-    <w:rsid w:val="00527527"/>
+    <w:rsid w:val="008250C1"/>
     <w:rPr>
       <w:rFonts w:eastAsiaTheme="majorEastAsia" w:cstheme="majorBidi"/>
       <w:i/>
@@ -2974,7 +2974,7 @@
     <w:link w:val="Heading9"/>
     <w:uiPriority w:val="9"/>
     <w:semiHidden/>
-    <w:rsid w:val="00527527"/>
+    <w:rsid w:val="008250C1"/>
     <w:rPr>
       <w:rFonts w:eastAsiaTheme="majorEastAsia" w:cstheme="majorBidi"/>
       <w:color w:val="272727" w:themeColor="text1" w:themeTint="D8"/>
@@ -2987,7 +2987,7 @@
     <w:link w:val="TitleChar"/>
     <w:uiPriority w:val="10"/>
     <w:qFormat/>
-    <w:rsid w:val="00527527"/>
+    <w:rsid w:val="008250C1"/>
     <w:pPr>
       <w:spacing w:after="80" w:line="240" w:lineRule="auto"/>
       <w:contextualSpacing/>
@@ -3005,7 +3005,7 @@
     <w:basedOn w:val="DefaultParagraphFont"/>
     <w:link w:val="Title"/>
     <w:uiPriority w:val="10"/>
-    <w:rsid w:val="00527527"/>
+    <w:rsid w:val="008250C1"/>
     <w:rPr>
       <w:rFonts w:asciiTheme="majorHAnsi" w:eastAsiaTheme="majorEastAsia" w:hAnsiTheme="majorHAnsi" w:cstheme="majorBidi"/>
       <w:spacing w:val="-10"/>
@@ -3021,7 +3021,7 @@
     <w:link w:val="SubtitleChar"/>
     <w:uiPriority w:val="11"/>
     <w:qFormat/>
-    <w:rsid w:val="00527527"/>
+    <w:rsid w:val="008250C1"/>
     <w:pPr>
       <w:numPr>
         <w:ilvl w:val="1"/>
@@ -3040,7 +3040,7 @@
     <w:basedOn w:val="DefaultParagraphFont"/>
     <w:link w:val="Subtitle"/>
     <w:uiPriority w:val="11"/>
-    <w:rsid w:val="00527527"/>
+    <w:rsid w:val="008250C1"/>
     <w:rPr>
       <w:rFonts w:eastAsiaTheme="majorEastAsia" w:cstheme="majorBidi"/>
       <w:color w:val="595959" w:themeColor="text1" w:themeTint="A6"/>
@@ -3056,7 +3056,7 @@
     <w:link w:val="QuoteChar"/>
     <w:uiPriority w:val="29"/>
     <w:qFormat/>
-    <w:rsid w:val="00527527"/>
+    <w:rsid w:val="008250C1"/>
     <w:pPr>
       <w:spacing w:before="160"/>
       <w:jc w:val="center"/>
@@ -3072,7 +3072,7 @@
     <w:basedOn w:val="DefaultParagraphFont"/>
     <w:link w:val="Quote"/>
     <w:uiPriority w:val="29"/>
-    <w:rsid w:val="00527527"/>
+    <w:rsid w:val="008250C1"/>
     <w:rPr>
       <w:i/>
       <w:iCs/>
@@ -3084,7 +3084,7 @@
     <w:basedOn w:val="Normal"/>
     <w:uiPriority w:val="34"/>
     <w:qFormat/>
-    <w:rsid w:val="00527527"/>
+    <w:rsid w:val="008250C1"/>
     <w:pPr>
       <w:ind w:left="720"/>
       <w:contextualSpacing/>
@@ -3095,7 +3095,7 @@
     <w:basedOn w:val="DefaultParagraphFont"/>
     <w:uiPriority w:val="21"/>
     <w:qFormat/>
-    <w:rsid w:val="00527527"/>
+    <w:rsid w:val="008250C1"/>
     <w:rPr>
       <w:i/>
       <w:iCs/>
@@ -3109,7 +3109,7 @@
     <w:link w:val="IntenseQuoteChar"/>
     <w:uiPriority w:val="30"/>
     <w:qFormat/>
-    <w:rsid w:val="00527527"/>
+    <w:rsid w:val="008250C1"/>
     <w:pPr>
       <w:pBdr>
         <w:top w:val="single" w:sz="4" w:space="10" w:color="0F4761" w:themeColor="accent1" w:themeShade="BF"/>
@@ -3130,7 +3130,7 @@
     <w:basedOn w:val="DefaultParagraphFont"/>
     <w:link w:val="IntenseQuote"/>
     <w:uiPriority w:val="30"/>
-    <w:rsid w:val="00527527"/>
+    <w:rsid w:val="008250C1"/>
     <w:rPr>
       <w:i/>
       <w:iCs/>
@@ -3142,7 +3142,7 @@
     <w:basedOn w:val="DefaultParagraphFont"/>
     <w:uiPriority w:val="32"/>
     <w:qFormat/>
-    <w:rsid w:val="00527527"/>
+    <w:rsid w:val="008250C1"/>
     <w:rPr>
       <w:b/>
       <w:bCs/>
@@ -3156,7 +3156,7 @@
     <w:basedOn w:val="Normal"/>
     <w:uiPriority w:val="99"/>
     <w:unhideWhenUsed/>
-    <w:rsid w:val="00527527"/>
+    <w:rsid w:val="008250C1"/>
     <w:pPr>
       <w:numPr>
         <w:numId w:val="1"/>

</xml_diff>